<commit_message>
interin sync fr jan
</commit_message>
<xml_diff>
--- a/flow/20230914_vu_template/прокімени.docx
+++ b/flow/20230914_vu_template/прокімени.docx
@@ -4,7 +4,7 @@
   <w:body>
     <w:p>
       <w:pPr>
-        <w:pStyle w:val="1"/>
+        <w:pStyle w:val="Heading1"/>
         <w:rPr>
           <w:rFonts w:ascii="Times New Roman" w:hAnsi="Times New Roman" w:cs="Times New Roman"/>
           <w:sz w:val="24"/>
@@ -86,7 +86,7 @@
     </w:p>
     <w:p>
       <w:pPr>
-        <w:pStyle w:val="2"/>
+        <w:pStyle w:val="Heading2"/>
         <w:rPr>
           <w:rFonts w:ascii="Times New Roman" w:hAnsi="Times New Roman" w:cs="Times New Roman"/>
           <w:sz w:val="24"/>
@@ -104,7 +104,7 @@
     </w:p>
     <w:p>
       <w:pPr>
-        <w:pStyle w:val="3"/>
+        <w:pStyle w:val="Heading3"/>
         <w:spacing w:before="0" w:after="120"/>
         <w:jc w:val="center"/>
         <w:rPr>
@@ -584,7 +584,7 @@
     </w:p>
     <w:p>
       <w:pPr>
-        <w:pStyle w:val="2"/>
+        <w:pStyle w:val="Heading2"/>
         <w:rPr>
           <w:rFonts w:ascii="Times New Roman" w:hAnsi="Times New Roman" w:cs="Times New Roman"/>
           <w:sz w:val="24"/>
@@ -602,7 +602,7 @@
     </w:p>
     <w:p>
       <w:pPr>
-        <w:pStyle w:val="3"/>
+        <w:pStyle w:val="Heading3"/>
         <w:spacing w:before="0" w:after="120"/>
         <w:jc w:val="center"/>
         <w:rPr>
@@ -1061,7 +1061,7 @@
     </w:p>
     <w:p>
       <w:pPr>
-        <w:pStyle w:val="2"/>
+        <w:pStyle w:val="Heading2"/>
         <w:rPr>
           <w:rFonts w:ascii="Times New Roman" w:hAnsi="Times New Roman" w:cs="Times New Roman"/>
           <w:sz w:val="24"/>
@@ -1079,7 +1079,7 @@
     </w:p>
     <w:p>
       <w:pPr>
-        <w:pStyle w:val="3"/>
+        <w:pStyle w:val="Heading3"/>
         <w:spacing w:before="0" w:after="120"/>
         <w:jc w:val="center"/>
         <w:rPr>
@@ -1678,7 +1678,7 @@
     </w:p>
     <w:p>
       <w:pPr>
-        <w:pStyle w:val="2"/>
+        <w:pStyle w:val="Heading2"/>
         <w:rPr>
           <w:rFonts w:ascii="Times New Roman" w:hAnsi="Times New Roman" w:cs="Times New Roman"/>
           <w:sz w:val="24"/>
@@ -1696,7 +1696,7 @@
     </w:p>
     <w:p>
       <w:pPr>
-        <w:pStyle w:val="3"/>
+        <w:pStyle w:val="Heading3"/>
         <w:spacing w:before="0" w:after="120"/>
         <w:jc w:val="center"/>
         <w:rPr>
@@ -2187,7 +2187,7 @@
     </w:p>
     <w:p>
       <w:pPr>
-        <w:pStyle w:val="2"/>
+        <w:pStyle w:val="Heading2"/>
         <w:rPr>
           <w:rFonts w:ascii="Times New Roman" w:hAnsi="Times New Roman" w:cs="Times New Roman"/>
           <w:sz w:val="24"/>
@@ -2221,7 +2221,7 @@
     </w:p>
     <w:p>
       <w:pPr>
-        <w:pStyle w:val="3"/>
+        <w:pStyle w:val="Heading3"/>
         <w:spacing w:before="0" w:after="120"/>
         <w:jc w:val="center"/>
         <w:rPr>
@@ -2716,7 +2716,7 @@
     </w:p>
     <w:p>
       <w:pPr>
-        <w:pStyle w:val="2"/>
+        <w:pStyle w:val="Heading2"/>
         <w:rPr>
           <w:rFonts w:ascii="Times New Roman" w:hAnsi="Times New Roman" w:cs="Times New Roman"/>
           <w:sz w:val="24"/>
@@ -2734,7 +2734,7 @@
     </w:p>
     <w:p>
       <w:pPr>
-        <w:pStyle w:val="3"/>
+        <w:pStyle w:val="Heading3"/>
         <w:spacing w:before="0" w:after="120"/>
         <w:jc w:val="center"/>
         <w:rPr>
@@ -3351,7 +3351,7 @@
     </w:p>
     <w:p>
       <w:pPr>
-        <w:pStyle w:val="2"/>
+        <w:pStyle w:val="Heading2"/>
       </w:pPr>
       <w:r>
         <w:t>Неділя</w:t>
@@ -3359,7 +3359,7 @@
     </w:p>
     <w:p>
       <w:pPr>
-        <w:pStyle w:val="3"/>
+        <w:pStyle w:val="Heading3"/>
         <w:spacing w:before="0" w:after="120"/>
         <w:jc w:val="center"/>
         <w:rPr>
@@ -4160,7 +4160,4050 @@
         <w:t>92,6).</w:t>
       </w:r>
     </w:p>
-    <w:p/>
+    <w:p>
+      <w:pPr>
+        <w:pStyle w:val="Heading1"/>
+      </w:pPr>
+      <w:r>
+        <w:t>Вечірня</w:t>
+      </w:r>
+      <w:r>
+        <w:t xml:space="preserve"> </w:t>
+      </w:r>
+      <w:r>
+        <w:t>–</w:t>
+      </w:r>
+      <w:r>
+        <w:t xml:space="preserve"> </w:t>
+      </w:r>
+      <w:r>
+        <w:t>Великі Прокімени</w:t>
+      </w:r>
+    </w:p>
+    <w:p>
+      <w:pPr>
+        <w:pStyle w:val="Heading3"/>
+        <w:spacing w:before="0" w:after="120"/>
+        <w:jc w:val="center"/>
+        <w:rPr>
+          <w:rFonts w:ascii="Times New Roman" w:hAnsi="Times New Roman" w:cs="Times New Roman"/>
+          <w:b/>
+          <w:bCs/>
+          <w:i/>
+          <w:iCs/>
+          <w:color w:val="FF0000"/>
+        </w:rPr>
+      </w:pPr>
+      <w:r>
+        <w:rPr>
+          <w:rFonts w:ascii="Times New Roman" w:hAnsi="Times New Roman" w:cs="Times New Roman"/>
+          <w:b/>
+          <w:bCs/>
+          <w:i/>
+          <w:iCs/>
+          <w:color w:val="FF0000"/>
+        </w:rPr>
+        <w:t>Прокімен</w:t>
+      </w:r>
+    </w:p>
+    <w:p>
+      <w:pPr>
+        <w:jc w:val="center"/>
+        <w:rPr>
+          <w:rFonts w:ascii="Times New Roman" w:hAnsi="Times New Roman" w:cs="Times New Roman"/>
+          <w:i/>
+          <w:iCs/>
+          <w:color w:val="FF0000"/>
+          <w:sz w:val="24"/>
+          <w:szCs w:val="24"/>
+        </w:rPr>
+      </w:pPr>
+      <w:r>
+        <w:rPr>
+          <w:rFonts w:ascii="Times New Roman" w:hAnsi="Times New Roman" w:cs="Times New Roman"/>
+          <w:i/>
+          <w:iCs/>
+          <w:color w:val="FF0000"/>
+          <w:sz w:val="24"/>
+          <w:szCs w:val="24"/>
+        </w:rPr>
+        <w:t>Псалом 76</w:t>
+      </w:r>
+    </w:p>
+    <w:p>
+      <w:pPr>
+        <w:rPr>
+          <w:rFonts w:ascii="Times New Roman" w:hAnsi="Times New Roman" w:cs="Times New Roman"/>
+          <w:b/>
+          <w:bCs/>
+          <w:sz w:val="24"/>
+          <w:szCs w:val="24"/>
+        </w:rPr>
+      </w:pPr>
+      <w:r>
+        <w:rPr>
+          <w:rFonts w:ascii="Times New Roman" w:hAnsi="Times New Roman" w:cs="Times New Roman"/>
+          <w:i/>
+          <w:iCs/>
+          <w:color w:val="FF0000"/>
+          <w:sz w:val="24"/>
+          <w:szCs w:val="24"/>
+        </w:rPr>
+        <w:t xml:space="preserve">(г. </w:t>
+      </w:r>
+      <w:r>
+        <w:rPr>
+          <w:rFonts w:ascii="Times New Roman" w:hAnsi="Times New Roman" w:cs="Times New Roman"/>
+          <w:i/>
+          <w:iCs/>
+          <w:color w:val="FF0000"/>
+          <w:sz w:val="24"/>
+          <w:szCs w:val="24"/>
+        </w:rPr>
+        <w:t>7</w:t>
+      </w:r>
+      <w:r>
+        <w:rPr>
+          <w:rFonts w:ascii="Times New Roman" w:hAnsi="Times New Roman" w:cs="Times New Roman"/>
+          <w:i/>
+          <w:iCs/>
+          <w:color w:val="FF0000"/>
+          <w:sz w:val="24"/>
+          <w:szCs w:val="24"/>
+        </w:rPr>
+        <w:t>)</w:t>
+      </w:r>
+      <w:r>
+        <w:rPr>
+          <w:rFonts w:ascii="Times New Roman" w:hAnsi="Times New Roman" w:cs="Times New Roman"/>
+          <w:i/>
+          <w:iCs/>
+          <w:color w:val="FF0000"/>
+          <w:sz w:val="24"/>
+          <w:szCs w:val="24"/>
+        </w:rPr>
+        <w:t xml:space="preserve">: </w:t>
+      </w:r>
+      <w:r>
+        <w:rPr>
+          <w:rFonts w:ascii="Times New Roman" w:hAnsi="Times New Roman" w:cs="Times New Roman"/>
+          <w:b/>
+          <w:bCs/>
+          <w:sz w:val="24"/>
+          <w:szCs w:val="24"/>
+        </w:rPr>
+        <w:t>Хто бог вели</w:t>
+      </w:r>
+      <w:r>
+        <w:rPr>
+          <w:rFonts w:ascii="Times New Roman" w:eastAsia="Gentium Plus" w:hAnsi="Times New Roman" w:cs="Times New Roman"/>
+          <w:b/>
+          <w:bCs/>
+          <w:color w:val="000000"/>
+          <w:sz w:val="24"/>
+          <w:szCs w:val="24"/>
+        </w:rPr>
+        <w:t>́</w:t>
+      </w:r>
+      <w:r>
+        <w:rPr>
+          <w:rFonts w:ascii="Times New Roman" w:hAnsi="Times New Roman" w:cs="Times New Roman"/>
+          <w:b/>
+          <w:bCs/>
+          <w:sz w:val="24"/>
+          <w:szCs w:val="24"/>
+        </w:rPr>
+        <w:t>кий, як Бог наш?* Ти той Бог, що тво</w:t>
+      </w:r>
+      <w:r>
+        <w:rPr>
+          <w:rFonts w:ascii="Times New Roman" w:eastAsia="Gentium Plus" w:hAnsi="Times New Roman" w:cs="Times New Roman"/>
+          <w:b/>
+          <w:bCs/>
+          <w:color w:val="000000"/>
+          <w:sz w:val="24"/>
+          <w:szCs w:val="24"/>
+        </w:rPr>
+        <w:t>́</w:t>
+      </w:r>
+      <w:r>
+        <w:rPr>
+          <w:rFonts w:ascii="Times New Roman" w:hAnsi="Times New Roman" w:cs="Times New Roman"/>
+          <w:b/>
+          <w:bCs/>
+          <w:sz w:val="24"/>
+          <w:szCs w:val="24"/>
+        </w:rPr>
+        <w:t>рить чудеса</w:t>
+      </w:r>
+      <w:r>
+        <w:rPr>
+          <w:rFonts w:ascii="Times New Roman" w:eastAsia="Gentium Plus" w:hAnsi="Times New Roman" w:cs="Times New Roman"/>
+          <w:b/>
+          <w:bCs/>
+          <w:color w:val="000000"/>
+          <w:sz w:val="24"/>
+          <w:szCs w:val="24"/>
+        </w:rPr>
+        <w:t>́</w:t>
+      </w:r>
+      <w:r>
+        <w:rPr>
+          <w:rFonts w:ascii="Times New Roman" w:hAnsi="Times New Roman" w:cs="Times New Roman"/>
+          <w:b/>
+          <w:bCs/>
+          <w:sz w:val="24"/>
+          <w:szCs w:val="24"/>
+        </w:rPr>
+        <w:t>.</w:t>
+      </w:r>
+    </w:p>
+    <w:p>
+      <w:pPr>
+        <w:rPr>
+          <w:rFonts w:ascii="Times New Roman" w:hAnsi="Times New Roman" w:cs="Times New Roman"/>
+          <w:sz w:val="24"/>
+          <w:szCs w:val="24"/>
+        </w:rPr>
+      </w:pPr>
+      <w:r>
+        <w:rPr>
+          <w:rFonts w:ascii="Times New Roman" w:hAnsi="Times New Roman" w:cs="Times New Roman"/>
+          <w:i/>
+          <w:color w:val="FF0000"/>
+          <w:sz w:val="24"/>
+          <w:szCs w:val="24"/>
+        </w:rPr>
+        <w:t xml:space="preserve">Стих: </w:t>
+      </w:r>
+      <w:r>
+        <w:rPr>
+          <w:rFonts w:ascii="Times New Roman" w:hAnsi="Times New Roman" w:cs="Times New Roman"/>
+          <w:sz w:val="24"/>
+          <w:szCs w:val="24"/>
+        </w:rPr>
+        <w:t>Ти показа</w:t>
+      </w:r>
+      <w:r>
+        <w:rPr>
+          <w:rFonts w:ascii="Times New Roman" w:eastAsia="Gentium Plus" w:hAnsi="Times New Roman" w:cs="Times New Roman"/>
+          <w:color w:val="000000"/>
+          <w:sz w:val="24"/>
+          <w:szCs w:val="24"/>
+        </w:rPr>
+        <w:t>́</w:t>
+      </w:r>
+      <w:r>
+        <w:rPr>
+          <w:rFonts w:ascii="Times New Roman" w:hAnsi="Times New Roman" w:cs="Times New Roman"/>
+          <w:sz w:val="24"/>
+          <w:szCs w:val="24"/>
+        </w:rPr>
+        <w:t>в між наро</w:t>
+      </w:r>
+      <w:r>
+        <w:rPr>
+          <w:rFonts w:ascii="Times New Roman" w:eastAsia="Gentium Plus" w:hAnsi="Times New Roman" w:cs="Times New Roman"/>
+          <w:color w:val="000000"/>
+          <w:sz w:val="24"/>
+          <w:szCs w:val="24"/>
+        </w:rPr>
+        <w:t>́</w:t>
+      </w:r>
+      <w:r>
+        <w:rPr>
+          <w:rFonts w:ascii="Times New Roman" w:hAnsi="Times New Roman" w:cs="Times New Roman"/>
+          <w:sz w:val="24"/>
+          <w:szCs w:val="24"/>
+        </w:rPr>
+        <w:t>дами си</w:t>
+      </w:r>
+      <w:r>
+        <w:rPr>
+          <w:rFonts w:ascii="Times New Roman" w:eastAsia="Gentium Plus" w:hAnsi="Times New Roman" w:cs="Times New Roman"/>
+          <w:color w:val="000000"/>
+          <w:sz w:val="24"/>
+          <w:szCs w:val="24"/>
+        </w:rPr>
+        <w:t>́</w:t>
+      </w:r>
+      <w:r>
+        <w:rPr>
+          <w:rFonts w:ascii="Times New Roman" w:hAnsi="Times New Roman" w:cs="Times New Roman"/>
+          <w:sz w:val="24"/>
+          <w:szCs w:val="24"/>
+        </w:rPr>
+        <w:t>лу Свою</w:t>
+      </w:r>
+      <w:r>
+        <w:rPr>
+          <w:rFonts w:ascii="Times New Roman" w:eastAsia="Gentium Plus" w:hAnsi="Times New Roman" w:cs="Times New Roman"/>
+          <w:color w:val="000000"/>
+          <w:sz w:val="24"/>
+          <w:szCs w:val="24"/>
+        </w:rPr>
+        <w:t>́</w:t>
+      </w:r>
+      <w:r>
+        <w:rPr>
+          <w:rFonts w:ascii="Times New Roman" w:hAnsi="Times New Roman" w:cs="Times New Roman"/>
+          <w:sz w:val="24"/>
+          <w:szCs w:val="24"/>
+        </w:rPr>
+        <w:t>.</w:t>
+      </w:r>
+    </w:p>
+    <w:p>
+      <w:pPr>
+        <w:rPr>
+          <w:rFonts w:ascii="Times New Roman" w:hAnsi="Times New Roman" w:cs="Times New Roman"/>
+          <w:sz w:val="24"/>
+          <w:szCs w:val="24"/>
+        </w:rPr>
+      </w:pPr>
+      <w:r>
+        <w:rPr>
+          <w:rFonts w:ascii="Times New Roman" w:hAnsi="Times New Roman" w:cs="Times New Roman"/>
+          <w:i/>
+          <w:color w:val="FF0000"/>
+          <w:sz w:val="24"/>
+          <w:szCs w:val="24"/>
+        </w:rPr>
+        <w:t xml:space="preserve">Стих: </w:t>
+      </w:r>
+      <w:r>
+        <w:rPr>
+          <w:rFonts w:ascii="Times New Roman" w:hAnsi="Times New Roman" w:cs="Times New Roman"/>
+          <w:sz w:val="24"/>
+          <w:szCs w:val="24"/>
+        </w:rPr>
+        <w:t>Я сказа</w:t>
+      </w:r>
+      <w:r>
+        <w:rPr>
+          <w:rFonts w:ascii="Times New Roman" w:eastAsia="Gentium Plus" w:hAnsi="Times New Roman" w:cs="Times New Roman"/>
+          <w:color w:val="000000"/>
+          <w:sz w:val="24"/>
+          <w:szCs w:val="24"/>
+        </w:rPr>
+        <w:t>́</w:t>
+      </w:r>
+      <w:r>
+        <w:rPr>
+          <w:rFonts w:ascii="Times New Roman" w:hAnsi="Times New Roman" w:cs="Times New Roman"/>
+          <w:sz w:val="24"/>
+          <w:szCs w:val="24"/>
+        </w:rPr>
+        <w:t>в: Тепе</w:t>
+      </w:r>
+      <w:r>
+        <w:rPr>
+          <w:rFonts w:ascii="Times New Roman" w:eastAsia="Gentium Plus" w:hAnsi="Times New Roman" w:cs="Times New Roman"/>
+          <w:color w:val="000000"/>
+          <w:sz w:val="24"/>
+          <w:szCs w:val="24"/>
+        </w:rPr>
+        <w:t>́</w:t>
+      </w:r>
+      <w:r>
+        <w:rPr>
+          <w:rFonts w:ascii="Times New Roman" w:hAnsi="Times New Roman" w:cs="Times New Roman"/>
+          <w:sz w:val="24"/>
+          <w:szCs w:val="24"/>
+        </w:rPr>
+        <w:t>р я розумі́ю, −це змі́на во</w:t>
+      </w:r>
+      <w:r>
+        <w:rPr>
+          <w:rFonts w:ascii="Times New Roman" w:eastAsia="Gentium Plus" w:hAnsi="Times New Roman" w:cs="Times New Roman"/>
+          <w:color w:val="000000"/>
+          <w:sz w:val="24"/>
+          <w:szCs w:val="24"/>
+        </w:rPr>
+        <w:t>́</w:t>
+      </w:r>
+      <w:r>
+        <w:rPr>
+          <w:rFonts w:ascii="Times New Roman" w:hAnsi="Times New Roman" w:cs="Times New Roman"/>
+          <w:sz w:val="24"/>
+          <w:szCs w:val="24"/>
+        </w:rPr>
+        <w:t>лі Всеви</w:t>
+      </w:r>
+      <w:r>
+        <w:rPr>
+          <w:rFonts w:ascii="Times New Roman" w:eastAsia="Gentium Plus" w:hAnsi="Times New Roman" w:cs="Times New Roman"/>
+          <w:color w:val="000000"/>
+          <w:sz w:val="24"/>
+          <w:szCs w:val="24"/>
+        </w:rPr>
+        <w:t>́</w:t>
+      </w:r>
+      <w:r>
+        <w:rPr>
+          <w:rFonts w:ascii="Times New Roman" w:hAnsi="Times New Roman" w:cs="Times New Roman"/>
+          <w:sz w:val="24"/>
+          <w:szCs w:val="24"/>
+        </w:rPr>
+        <w:t>шнього.</w:t>
+      </w:r>
+    </w:p>
+    <w:p>
+      <w:pPr>
+        <w:rPr>
+          <w:rFonts w:ascii="Times New Roman" w:hAnsi="Times New Roman" w:cs="Times New Roman"/>
+          <w:sz w:val="24"/>
+          <w:szCs w:val="24"/>
+        </w:rPr>
+      </w:pPr>
+      <w:r>
+        <w:rPr>
+          <w:rFonts w:ascii="Times New Roman" w:hAnsi="Times New Roman" w:cs="Times New Roman"/>
+          <w:i/>
+          <w:color w:val="FF0000"/>
+          <w:sz w:val="24"/>
+          <w:szCs w:val="24"/>
+        </w:rPr>
+        <w:lastRenderedPageBreak/>
+        <w:t xml:space="preserve">Стих: </w:t>
+      </w:r>
+      <w:r>
+        <w:rPr>
+          <w:rFonts w:ascii="Times New Roman" w:hAnsi="Times New Roman" w:cs="Times New Roman"/>
+          <w:sz w:val="24"/>
+          <w:szCs w:val="24"/>
+        </w:rPr>
+        <w:t>Я згада</w:t>
+      </w:r>
+      <w:r>
+        <w:rPr>
+          <w:rFonts w:ascii="Times New Roman" w:eastAsia="Gentium Plus" w:hAnsi="Times New Roman" w:cs="Times New Roman"/>
+          <w:color w:val="000000"/>
+          <w:sz w:val="24"/>
+          <w:szCs w:val="24"/>
+        </w:rPr>
+        <w:t>́</w:t>
+      </w:r>
+      <w:r>
+        <w:rPr>
+          <w:rFonts w:ascii="Times New Roman" w:hAnsi="Times New Roman" w:cs="Times New Roman"/>
+          <w:sz w:val="24"/>
+          <w:szCs w:val="24"/>
+        </w:rPr>
+        <w:t>в діла</w:t>
+      </w:r>
+      <w:r>
+        <w:rPr>
+          <w:rFonts w:ascii="Times New Roman" w:eastAsia="Gentium Plus" w:hAnsi="Times New Roman" w:cs="Times New Roman"/>
+          <w:color w:val="000000"/>
+          <w:sz w:val="24"/>
+          <w:szCs w:val="24"/>
+        </w:rPr>
+        <w:t>́</w:t>
+      </w:r>
+      <w:r>
+        <w:rPr>
+          <w:rFonts w:ascii="Times New Roman" w:hAnsi="Times New Roman" w:cs="Times New Roman"/>
+          <w:sz w:val="24"/>
+          <w:szCs w:val="24"/>
+        </w:rPr>
+        <w:t xml:space="preserve"> Госпо</w:t>
+      </w:r>
+      <w:r>
+        <w:rPr>
+          <w:rFonts w:ascii="Times New Roman" w:eastAsia="Gentium Plus" w:hAnsi="Times New Roman" w:cs="Times New Roman"/>
+          <w:color w:val="000000"/>
+          <w:sz w:val="24"/>
+          <w:szCs w:val="24"/>
+        </w:rPr>
+        <w:t>́</w:t>
+      </w:r>
+      <w:r>
+        <w:rPr>
+          <w:rFonts w:ascii="Times New Roman" w:hAnsi="Times New Roman" w:cs="Times New Roman"/>
+          <w:sz w:val="24"/>
+          <w:szCs w:val="24"/>
+        </w:rPr>
+        <w:t>дні, бо пригада</w:t>
+      </w:r>
+      <w:r>
+        <w:rPr>
+          <w:rFonts w:ascii="Times New Roman" w:eastAsia="Gentium Plus" w:hAnsi="Times New Roman" w:cs="Times New Roman"/>
+          <w:color w:val="000000"/>
+          <w:sz w:val="24"/>
+          <w:szCs w:val="24"/>
+        </w:rPr>
+        <w:t>́</w:t>
+      </w:r>
+      <w:r>
+        <w:rPr>
+          <w:rFonts w:ascii="Times New Roman" w:hAnsi="Times New Roman" w:cs="Times New Roman"/>
+          <w:sz w:val="24"/>
+          <w:szCs w:val="24"/>
+        </w:rPr>
+        <w:t>в усі́ да</w:t>
+      </w:r>
+      <w:r>
+        <w:rPr>
+          <w:rFonts w:ascii="Times New Roman" w:eastAsia="Gentium Plus" w:hAnsi="Times New Roman" w:cs="Times New Roman"/>
+          <w:color w:val="000000"/>
+          <w:sz w:val="24"/>
+          <w:szCs w:val="24"/>
+        </w:rPr>
+        <w:t>́</w:t>
+      </w:r>
+      <w:r>
+        <w:rPr>
+          <w:rFonts w:ascii="Times New Roman" w:hAnsi="Times New Roman" w:cs="Times New Roman"/>
+          <w:sz w:val="24"/>
+          <w:szCs w:val="24"/>
+        </w:rPr>
+        <w:t>вні чуда</w:t>
+      </w:r>
+      <w:r>
+        <w:rPr>
+          <w:rFonts w:ascii="Times New Roman" w:eastAsia="Gentium Plus" w:hAnsi="Times New Roman" w:cs="Times New Roman"/>
+          <w:color w:val="000000"/>
+          <w:sz w:val="24"/>
+          <w:szCs w:val="24"/>
+        </w:rPr>
+        <w:t>́</w:t>
+      </w:r>
+      <w:r>
+        <w:rPr>
+          <w:rFonts w:ascii="Times New Roman" w:hAnsi="Times New Roman" w:cs="Times New Roman"/>
+          <w:sz w:val="24"/>
+          <w:szCs w:val="24"/>
+        </w:rPr>
+        <w:t xml:space="preserve"> Тво</w:t>
+      </w:r>
+      <w:r>
+        <w:rPr>
+          <w:rFonts w:ascii="Times New Roman" w:eastAsia="Gentium Plus" w:hAnsi="Times New Roman" w:cs="Times New Roman"/>
+          <w:color w:val="000000"/>
+          <w:sz w:val="24"/>
+          <w:szCs w:val="24"/>
+        </w:rPr>
+        <w:t>ї́</w:t>
+      </w:r>
+      <w:r>
+        <w:rPr>
+          <w:rFonts w:ascii="Times New Roman" w:hAnsi="Times New Roman" w:cs="Times New Roman"/>
+          <w:sz w:val="24"/>
+          <w:szCs w:val="24"/>
+        </w:rPr>
+        <w:t>.</w:t>
+      </w:r>
+    </w:p>
+    <w:p>
+      <w:pPr>
+        <w:pStyle w:val="Heading3"/>
+        <w:spacing w:before="0" w:after="120"/>
+        <w:jc w:val="center"/>
+        <w:rPr>
+          <w:rFonts w:ascii="Times New Roman" w:hAnsi="Times New Roman" w:cs="Times New Roman"/>
+          <w:b/>
+          <w:bCs/>
+          <w:i/>
+          <w:iCs/>
+          <w:color w:val="FF0000"/>
+        </w:rPr>
+      </w:pPr>
+      <w:r>
+        <w:rPr>
+          <w:rFonts w:ascii="Times New Roman" w:hAnsi="Times New Roman" w:cs="Times New Roman"/>
+          <w:b/>
+          <w:bCs/>
+          <w:i/>
+          <w:iCs/>
+          <w:color w:val="FF0000"/>
+        </w:rPr>
+        <w:t>Прокімен</w:t>
+      </w:r>
+    </w:p>
+    <w:p>
+      <w:pPr>
+        <w:jc w:val="center"/>
+        <w:rPr>
+          <w:rFonts w:ascii="Times New Roman" w:hAnsi="Times New Roman" w:cs="Times New Roman"/>
+          <w:i/>
+          <w:iCs/>
+          <w:color w:val="FF0000"/>
+          <w:sz w:val="24"/>
+          <w:szCs w:val="24"/>
+        </w:rPr>
+      </w:pPr>
+      <w:r>
+        <w:rPr>
+          <w:rFonts w:ascii="Times New Roman" w:hAnsi="Times New Roman" w:cs="Times New Roman"/>
+          <w:i/>
+          <w:iCs/>
+          <w:color w:val="FF0000"/>
+          <w:sz w:val="24"/>
+          <w:szCs w:val="24"/>
+        </w:rPr>
+        <w:t>Псалом 113</w:t>
+      </w:r>
+    </w:p>
+    <w:p>
+      <w:pPr>
+        <w:rPr>
+          <w:rFonts w:ascii="Times New Roman" w:hAnsi="Times New Roman" w:cs="Times New Roman"/>
+          <w:b/>
+          <w:bCs/>
+          <w:sz w:val="24"/>
+          <w:szCs w:val="24"/>
+        </w:rPr>
+      </w:pPr>
+      <w:r>
+        <w:rPr>
+          <w:rFonts w:ascii="Times New Roman" w:hAnsi="Times New Roman" w:cs="Times New Roman"/>
+          <w:i/>
+          <w:iCs/>
+          <w:color w:val="FF0000"/>
+          <w:sz w:val="24"/>
+          <w:szCs w:val="24"/>
+        </w:rPr>
+        <w:t xml:space="preserve">(г. </w:t>
+      </w:r>
+      <w:r>
+        <w:rPr>
+          <w:rFonts w:ascii="Times New Roman" w:hAnsi="Times New Roman" w:cs="Times New Roman"/>
+          <w:i/>
+          <w:iCs/>
+          <w:color w:val="FF0000"/>
+          <w:sz w:val="24"/>
+          <w:szCs w:val="24"/>
+        </w:rPr>
+        <w:t>7</w:t>
+      </w:r>
+      <w:r>
+        <w:rPr>
+          <w:rFonts w:ascii="Times New Roman" w:hAnsi="Times New Roman" w:cs="Times New Roman"/>
+          <w:i/>
+          <w:iCs/>
+          <w:color w:val="FF0000"/>
+          <w:sz w:val="24"/>
+          <w:szCs w:val="24"/>
+        </w:rPr>
+        <w:t>)</w:t>
+      </w:r>
+      <w:r>
+        <w:rPr>
+          <w:rFonts w:ascii="Times New Roman" w:hAnsi="Times New Roman" w:cs="Times New Roman"/>
+          <w:i/>
+          <w:iCs/>
+          <w:color w:val="FF0000"/>
+          <w:sz w:val="24"/>
+          <w:szCs w:val="24"/>
+        </w:rPr>
+        <w:t xml:space="preserve">: </w:t>
+      </w:r>
+      <w:r>
+        <w:rPr>
+          <w:rFonts w:ascii="Times New Roman" w:hAnsi="Times New Roman" w:cs="Times New Roman"/>
+          <w:b/>
+          <w:bCs/>
+          <w:sz w:val="24"/>
+          <w:szCs w:val="24"/>
+        </w:rPr>
+        <w:t>Бог наш на не</w:t>
+      </w:r>
+      <w:r>
+        <w:rPr>
+          <w:rFonts w:ascii="Times New Roman" w:eastAsia="Gentium Plus" w:hAnsi="Times New Roman" w:cs="Times New Roman"/>
+          <w:b/>
+          <w:bCs/>
+          <w:color w:val="000000"/>
+          <w:sz w:val="24"/>
+          <w:szCs w:val="24"/>
+        </w:rPr>
+        <w:t>́</w:t>
+      </w:r>
+      <w:r>
+        <w:rPr>
+          <w:rFonts w:ascii="Times New Roman" w:hAnsi="Times New Roman" w:cs="Times New Roman"/>
+          <w:b/>
+          <w:bCs/>
+          <w:sz w:val="24"/>
+          <w:szCs w:val="24"/>
+        </w:rPr>
+        <w:t>бі й на землі́,* все, що схоті́в, створи</w:t>
+      </w:r>
+      <w:r>
+        <w:rPr>
+          <w:rFonts w:ascii="Times New Roman" w:eastAsia="Gentium Plus" w:hAnsi="Times New Roman" w:cs="Times New Roman"/>
+          <w:b/>
+          <w:bCs/>
+          <w:color w:val="000000"/>
+          <w:sz w:val="24"/>
+          <w:szCs w:val="24"/>
+        </w:rPr>
+        <w:t>́</w:t>
+      </w:r>
+      <w:r>
+        <w:rPr>
+          <w:rFonts w:ascii="Times New Roman" w:hAnsi="Times New Roman" w:cs="Times New Roman"/>
+          <w:b/>
+          <w:bCs/>
+          <w:sz w:val="24"/>
+          <w:szCs w:val="24"/>
+        </w:rPr>
+        <w:t>в Він.</w:t>
+      </w:r>
+    </w:p>
+    <w:p>
+      <w:pPr>
+        <w:rPr>
+          <w:rFonts w:ascii="Times New Roman" w:hAnsi="Times New Roman" w:cs="Times New Roman"/>
+          <w:sz w:val="24"/>
+          <w:szCs w:val="24"/>
+          <w:shd w:val="clear" w:color="auto" w:fill="FFFF00"/>
+        </w:rPr>
+      </w:pPr>
+      <w:r>
+        <w:rPr>
+          <w:rFonts w:ascii="Times New Roman" w:hAnsi="Times New Roman" w:cs="Times New Roman"/>
+          <w:i/>
+          <w:color w:val="FF0000"/>
+          <w:sz w:val="24"/>
+          <w:szCs w:val="24"/>
+        </w:rPr>
+        <w:t xml:space="preserve">Стих: </w:t>
+      </w:r>
+      <w:r>
+        <w:rPr>
+          <w:rFonts w:ascii="Times New Roman" w:hAnsi="Times New Roman" w:cs="Times New Roman"/>
+          <w:sz w:val="24"/>
+          <w:szCs w:val="24"/>
+        </w:rPr>
+        <w:t>Коли</w:t>
+      </w:r>
+      <w:r>
+        <w:rPr>
+          <w:rFonts w:ascii="Times New Roman" w:eastAsia="Gentium Plus" w:hAnsi="Times New Roman" w:cs="Times New Roman"/>
+          <w:color w:val="000000"/>
+          <w:sz w:val="24"/>
+          <w:szCs w:val="24"/>
+        </w:rPr>
+        <w:t>́</w:t>
+      </w:r>
+      <w:r>
+        <w:rPr>
+          <w:rFonts w:ascii="Times New Roman" w:hAnsi="Times New Roman" w:cs="Times New Roman"/>
+          <w:sz w:val="24"/>
+          <w:szCs w:val="24"/>
+        </w:rPr>
+        <w:t xml:space="preserve"> ви</w:t>
+      </w:r>
+      <w:r>
+        <w:rPr>
+          <w:rFonts w:ascii="Times New Roman" w:eastAsia="Gentium Plus" w:hAnsi="Times New Roman" w:cs="Times New Roman"/>
+          <w:color w:val="000000"/>
+          <w:sz w:val="24"/>
+          <w:szCs w:val="24"/>
+        </w:rPr>
+        <w:t>́</w:t>
+      </w:r>
+      <w:r>
+        <w:rPr>
+          <w:rFonts w:ascii="Times New Roman" w:hAnsi="Times New Roman" w:cs="Times New Roman"/>
+          <w:sz w:val="24"/>
+          <w:szCs w:val="24"/>
+        </w:rPr>
+        <w:t>йшов Ізра</w:t>
+      </w:r>
+      <w:r>
+        <w:rPr>
+          <w:rFonts w:ascii="Times New Roman" w:eastAsia="Gentium Plus" w:hAnsi="Times New Roman" w:cs="Times New Roman"/>
+          <w:color w:val="000000"/>
+          <w:sz w:val="24"/>
+          <w:szCs w:val="24"/>
+        </w:rPr>
+        <w:t>́</w:t>
+      </w:r>
+      <w:r>
+        <w:rPr>
+          <w:rFonts w:ascii="Times New Roman" w:hAnsi="Times New Roman" w:cs="Times New Roman"/>
+          <w:sz w:val="24"/>
+          <w:szCs w:val="24"/>
+        </w:rPr>
+        <w:t>їль з Єги</w:t>
+      </w:r>
+      <w:r>
+        <w:rPr>
+          <w:rFonts w:ascii="Times New Roman" w:eastAsia="Gentium Plus" w:hAnsi="Times New Roman" w:cs="Times New Roman"/>
+          <w:color w:val="000000"/>
+          <w:sz w:val="24"/>
+          <w:szCs w:val="24"/>
+        </w:rPr>
+        <w:t>́</w:t>
+      </w:r>
+      <w:r>
+        <w:rPr>
+          <w:rFonts w:ascii="Times New Roman" w:hAnsi="Times New Roman" w:cs="Times New Roman"/>
+          <w:sz w:val="24"/>
+          <w:szCs w:val="24"/>
+        </w:rPr>
+        <w:t xml:space="preserve">пту, дім </w:t>
+      </w:r>
+      <w:r>
+        <w:rPr>
+          <w:rFonts w:ascii="Times New Roman" w:eastAsia="Georgia" w:hAnsi="Times New Roman" w:cs="Times New Roman"/>
+          <w:color w:val="000000"/>
+          <w:sz w:val="24"/>
+          <w:szCs w:val="24"/>
+        </w:rPr>
+        <w:t>Я́</w:t>
+      </w:r>
+      <w:r>
+        <w:rPr>
+          <w:rFonts w:ascii="Times New Roman" w:hAnsi="Times New Roman" w:cs="Times New Roman"/>
+          <w:sz w:val="24"/>
+          <w:szCs w:val="24"/>
+        </w:rPr>
+        <w:t>кова з-по</w:t>
+      </w:r>
+      <w:r>
+        <w:rPr>
+          <w:rFonts w:ascii="Times New Roman" w:eastAsia="Gentium Plus" w:hAnsi="Times New Roman" w:cs="Times New Roman"/>
+          <w:color w:val="000000"/>
+          <w:sz w:val="24"/>
+          <w:szCs w:val="24"/>
+        </w:rPr>
+        <w:t>́</w:t>
+      </w:r>
+      <w:r>
+        <w:rPr>
+          <w:rFonts w:ascii="Times New Roman" w:hAnsi="Times New Roman" w:cs="Times New Roman"/>
+          <w:sz w:val="24"/>
+          <w:szCs w:val="24"/>
+        </w:rPr>
+        <w:t>між ва</w:t>
+      </w:r>
+      <w:r>
+        <w:rPr>
+          <w:rFonts w:ascii="Times New Roman" w:eastAsia="Gentium Plus" w:hAnsi="Times New Roman" w:cs="Times New Roman"/>
+          <w:color w:val="000000"/>
+          <w:sz w:val="24"/>
+          <w:szCs w:val="24"/>
+        </w:rPr>
+        <w:t>́</w:t>
+      </w:r>
+      <w:r>
+        <w:rPr>
+          <w:rFonts w:ascii="Times New Roman" w:hAnsi="Times New Roman" w:cs="Times New Roman"/>
+          <w:sz w:val="24"/>
+          <w:szCs w:val="24"/>
+        </w:rPr>
+        <w:t>рварів, святи</w:t>
+      </w:r>
+      <w:r>
+        <w:rPr>
+          <w:rFonts w:ascii="Times New Roman" w:eastAsia="Gentium Plus" w:hAnsi="Times New Roman" w:cs="Times New Roman"/>
+          <w:color w:val="000000"/>
+          <w:sz w:val="24"/>
+          <w:szCs w:val="24"/>
+        </w:rPr>
+        <w:t>́</w:t>
+      </w:r>
+      <w:r>
+        <w:rPr>
+          <w:rFonts w:ascii="Times New Roman" w:hAnsi="Times New Roman" w:cs="Times New Roman"/>
+          <w:sz w:val="24"/>
+          <w:szCs w:val="24"/>
+        </w:rPr>
+        <w:t>нею його</w:t>
+      </w:r>
+      <w:r>
+        <w:rPr>
+          <w:rFonts w:ascii="Times New Roman" w:eastAsia="Gentium Plus" w:hAnsi="Times New Roman" w:cs="Times New Roman"/>
+          <w:color w:val="000000"/>
+          <w:sz w:val="24"/>
+          <w:szCs w:val="24"/>
+        </w:rPr>
+        <w:t>́</w:t>
+      </w:r>
+      <w:r>
+        <w:rPr>
+          <w:rFonts w:ascii="Times New Roman" w:hAnsi="Times New Roman" w:cs="Times New Roman"/>
+          <w:sz w:val="24"/>
+          <w:szCs w:val="24"/>
+        </w:rPr>
+        <w:t xml:space="preserve"> ста</w:t>
+      </w:r>
+      <w:r>
+        <w:rPr>
+          <w:rFonts w:ascii="Times New Roman" w:eastAsia="Gentium Plus" w:hAnsi="Times New Roman" w:cs="Times New Roman"/>
+          <w:color w:val="000000"/>
+          <w:sz w:val="24"/>
+          <w:szCs w:val="24"/>
+        </w:rPr>
+        <w:t>́</w:t>
+      </w:r>
+      <w:r>
+        <w:rPr>
+          <w:rFonts w:ascii="Times New Roman" w:hAnsi="Times New Roman" w:cs="Times New Roman"/>
+          <w:sz w:val="24"/>
+          <w:szCs w:val="24"/>
+        </w:rPr>
+        <w:t>ла Юде</w:t>
+      </w:r>
+      <w:r>
+        <w:rPr>
+          <w:rFonts w:ascii="Times New Roman" w:eastAsia="Gentium Plus" w:hAnsi="Times New Roman" w:cs="Times New Roman"/>
+          <w:color w:val="000000"/>
+          <w:sz w:val="24"/>
+          <w:szCs w:val="24"/>
+        </w:rPr>
+        <w:t>́</w:t>
+      </w:r>
+      <w:r>
+        <w:rPr>
+          <w:rFonts w:ascii="Times New Roman" w:hAnsi="Times New Roman" w:cs="Times New Roman"/>
+          <w:sz w:val="24"/>
+          <w:szCs w:val="24"/>
+        </w:rPr>
+        <w:t>я.</w:t>
+      </w:r>
+    </w:p>
+    <w:p>
+      <w:pPr>
+        <w:rPr>
+          <w:rFonts w:ascii="Times New Roman" w:hAnsi="Times New Roman" w:cs="Times New Roman"/>
+          <w:sz w:val="24"/>
+          <w:szCs w:val="24"/>
+        </w:rPr>
+      </w:pPr>
+      <w:r>
+        <w:rPr>
+          <w:rFonts w:ascii="Times New Roman" w:hAnsi="Times New Roman" w:cs="Times New Roman"/>
+          <w:i/>
+          <w:color w:val="FF0000"/>
+          <w:sz w:val="24"/>
+          <w:szCs w:val="24"/>
+        </w:rPr>
+        <w:t xml:space="preserve">Стих: </w:t>
+      </w:r>
+      <w:r>
+        <w:rPr>
+          <w:rFonts w:ascii="Times New Roman" w:hAnsi="Times New Roman" w:cs="Times New Roman"/>
+          <w:sz w:val="24"/>
+          <w:szCs w:val="24"/>
+        </w:rPr>
+        <w:t>Мо</w:t>
+      </w:r>
+      <w:r>
+        <w:rPr>
+          <w:rFonts w:ascii="Times New Roman" w:eastAsia="Gentium Plus" w:hAnsi="Times New Roman" w:cs="Times New Roman"/>
+          <w:color w:val="000000"/>
+          <w:sz w:val="24"/>
+          <w:szCs w:val="24"/>
+        </w:rPr>
+        <w:t>́</w:t>
+      </w:r>
+      <w:r>
+        <w:rPr>
+          <w:rFonts w:ascii="Times New Roman" w:hAnsi="Times New Roman" w:cs="Times New Roman"/>
+          <w:sz w:val="24"/>
+          <w:szCs w:val="24"/>
+        </w:rPr>
+        <w:t>ре поба</w:t>
+      </w:r>
+      <w:r>
+        <w:rPr>
+          <w:rFonts w:ascii="Times New Roman" w:eastAsia="Gentium Plus" w:hAnsi="Times New Roman" w:cs="Times New Roman"/>
+          <w:color w:val="000000"/>
+          <w:sz w:val="24"/>
+          <w:szCs w:val="24"/>
+        </w:rPr>
+        <w:t>́</w:t>
+      </w:r>
+      <w:r>
+        <w:rPr>
+          <w:rFonts w:ascii="Times New Roman" w:hAnsi="Times New Roman" w:cs="Times New Roman"/>
+          <w:sz w:val="24"/>
+          <w:szCs w:val="24"/>
+        </w:rPr>
+        <w:t>чило те й ки</w:t>
+      </w:r>
+      <w:r>
+        <w:rPr>
+          <w:rFonts w:ascii="Times New Roman" w:eastAsia="Gentium Plus" w:hAnsi="Times New Roman" w:cs="Times New Roman"/>
+          <w:color w:val="000000"/>
+          <w:sz w:val="24"/>
+          <w:szCs w:val="24"/>
+        </w:rPr>
+        <w:t>́</w:t>
+      </w:r>
+      <w:r>
+        <w:rPr>
+          <w:rFonts w:ascii="Times New Roman" w:hAnsi="Times New Roman" w:cs="Times New Roman"/>
+          <w:sz w:val="24"/>
+          <w:szCs w:val="24"/>
+        </w:rPr>
+        <w:t>нулось тіка</w:t>
+      </w:r>
+      <w:r>
+        <w:rPr>
+          <w:rFonts w:ascii="Times New Roman" w:eastAsia="Gentium Plus" w:hAnsi="Times New Roman" w:cs="Times New Roman"/>
+          <w:color w:val="000000"/>
+          <w:sz w:val="24"/>
+          <w:szCs w:val="24"/>
+        </w:rPr>
+        <w:t>́</w:t>
+      </w:r>
+      <w:r>
+        <w:rPr>
+          <w:rFonts w:ascii="Times New Roman" w:hAnsi="Times New Roman" w:cs="Times New Roman"/>
+          <w:sz w:val="24"/>
+          <w:szCs w:val="24"/>
+        </w:rPr>
+        <w:t>ти, Йорда</w:t>
+      </w:r>
+      <w:r>
+        <w:rPr>
+          <w:rFonts w:ascii="Times New Roman" w:eastAsia="Gentium Plus" w:hAnsi="Times New Roman" w:cs="Times New Roman"/>
+          <w:color w:val="000000"/>
+          <w:sz w:val="24"/>
+          <w:szCs w:val="24"/>
+        </w:rPr>
+        <w:t>́</w:t>
+      </w:r>
+      <w:r>
+        <w:rPr>
+          <w:rFonts w:ascii="Times New Roman" w:hAnsi="Times New Roman" w:cs="Times New Roman"/>
+          <w:sz w:val="24"/>
+          <w:szCs w:val="24"/>
+        </w:rPr>
+        <w:t>н наза</w:t>
+      </w:r>
+      <w:r>
+        <w:rPr>
+          <w:rFonts w:ascii="Times New Roman" w:eastAsia="Gentium Plus" w:hAnsi="Times New Roman" w:cs="Times New Roman"/>
+          <w:color w:val="000000"/>
+          <w:sz w:val="24"/>
+          <w:szCs w:val="24"/>
+        </w:rPr>
+        <w:t>́</w:t>
+      </w:r>
+      <w:r>
+        <w:rPr>
+          <w:rFonts w:ascii="Times New Roman" w:hAnsi="Times New Roman" w:cs="Times New Roman"/>
+          <w:sz w:val="24"/>
+          <w:szCs w:val="24"/>
+        </w:rPr>
+        <w:t>д поверну</w:t>
+      </w:r>
+      <w:r>
+        <w:rPr>
+          <w:rFonts w:ascii="Times New Roman" w:eastAsia="Gentium Plus" w:hAnsi="Times New Roman" w:cs="Times New Roman"/>
+          <w:color w:val="000000"/>
+          <w:sz w:val="24"/>
+          <w:szCs w:val="24"/>
+        </w:rPr>
+        <w:t>́</w:t>
+      </w:r>
+      <w:r>
+        <w:rPr>
+          <w:rFonts w:ascii="Times New Roman" w:hAnsi="Times New Roman" w:cs="Times New Roman"/>
+          <w:sz w:val="24"/>
+          <w:szCs w:val="24"/>
+        </w:rPr>
+        <w:t>вся.</w:t>
+      </w:r>
+    </w:p>
+    <w:p>
+      <w:pPr>
+        <w:rPr>
+          <w:rFonts w:ascii="Times New Roman" w:hAnsi="Times New Roman" w:cs="Times New Roman"/>
+          <w:sz w:val="24"/>
+          <w:szCs w:val="24"/>
+        </w:rPr>
+      </w:pPr>
+      <w:r>
+        <w:rPr>
+          <w:rFonts w:ascii="Times New Roman" w:hAnsi="Times New Roman" w:cs="Times New Roman"/>
+          <w:i/>
+          <w:color w:val="FF0000"/>
+          <w:sz w:val="24"/>
+          <w:szCs w:val="24"/>
+        </w:rPr>
+        <w:t xml:space="preserve">Стих: </w:t>
+      </w:r>
+      <w:r>
+        <w:rPr>
+          <w:rFonts w:ascii="Times New Roman" w:hAnsi="Times New Roman" w:cs="Times New Roman"/>
+          <w:sz w:val="24"/>
+          <w:szCs w:val="24"/>
+        </w:rPr>
+        <w:t>Що з тобо</w:t>
+      </w:r>
+      <w:r>
+        <w:rPr>
+          <w:rFonts w:ascii="Times New Roman" w:eastAsia="Gentium Plus" w:hAnsi="Times New Roman" w:cs="Times New Roman"/>
+          <w:color w:val="000000"/>
+          <w:sz w:val="24"/>
+          <w:szCs w:val="24"/>
+        </w:rPr>
+        <w:t>́</w:t>
+      </w:r>
+      <w:r>
+        <w:rPr>
+          <w:rFonts w:ascii="Times New Roman" w:hAnsi="Times New Roman" w:cs="Times New Roman"/>
+          <w:sz w:val="24"/>
+          <w:szCs w:val="24"/>
+        </w:rPr>
+        <w:t>ю, мо</w:t>
+      </w:r>
+      <w:r>
+        <w:rPr>
+          <w:rFonts w:ascii="Times New Roman" w:eastAsia="Gentium Plus" w:hAnsi="Times New Roman" w:cs="Times New Roman"/>
+          <w:color w:val="000000"/>
+          <w:sz w:val="24"/>
+          <w:szCs w:val="24"/>
+        </w:rPr>
+        <w:t>́</w:t>
+      </w:r>
+      <w:r>
+        <w:rPr>
+          <w:rFonts w:ascii="Times New Roman" w:hAnsi="Times New Roman" w:cs="Times New Roman"/>
+          <w:sz w:val="24"/>
+          <w:szCs w:val="24"/>
+        </w:rPr>
+        <w:t>ре, що ти ки</w:t>
+      </w:r>
+      <w:r>
+        <w:rPr>
+          <w:rFonts w:ascii="Times New Roman" w:eastAsia="Gentium Plus" w:hAnsi="Times New Roman" w:cs="Times New Roman"/>
+          <w:color w:val="000000"/>
+          <w:sz w:val="24"/>
+          <w:szCs w:val="24"/>
+        </w:rPr>
+        <w:t>́</w:t>
+      </w:r>
+      <w:r>
+        <w:rPr>
+          <w:rFonts w:ascii="Times New Roman" w:hAnsi="Times New Roman" w:cs="Times New Roman"/>
+          <w:sz w:val="24"/>
+          <w:szCs w:val="24"/>
+        </w:rPr>
+        <w:t>нулось тіка</w:t>
+      </w:r>
+      <w:r>
+        <w:rPr>
+          <w:rFonts w:ascii="Times New Roman" w:eastAsia="Gentium Plus" w:hAnsi="Times New Roman" w:cs="Times New Roman"/>
+          <w:color w:val="000000"/>
+          <w:sz w:val="24"/>
+          <w:szCs w:val="24"/>
+        </w:rPr>
+        <w:t>́</w:t>
+      </w:r>
+      <w:r>
+        <w:rPr>
+          <w:rFonts w:ascii="Times New Roman" w:hAnsi="Times New Roman" w:cs="Times New Roman"/>
+          <w:sz w:val="24"/>
+          <w:szCs w:val="24"/>
+        </w:rPr>
+        <w:t>ти, і тобі́ Йорда</w:t>
+      </w:r>
+      <w:r>
+        <w:rPr>
+          <w:rFonts w:ascii="Times New Roman" w:eastAsia="Gentium Plus" w:hAnsi="Times New Roman" w:cs="Times New Roman"/>
+          <w:color w:val="000000"/>
+          <w:sz w:val="24"/>
+          <w:szCs w:val="24"/>
+        </w:rPr>
+        <w:t>́</w:t>
+      </w:r>
+      <w:r>
+        <w:rPr>
+          <w:rFonts w:ascii="Times New Roman" w:hAnsi="Times New Roman" w:cs="Times New Roman"/>
+          <w:sz w:val="24"/>
+          <w:szCs w:val="24"/>
+        </w:rPr>
+        <w:t>не, що ти наза</w:t>
+      </w:r>
+      <w:r>
+        <w:rPr>
+          <w:rFonts w:ascii="Times New Roman" w:eastAsia="Gentium Plus" w:hAnsi="Times New Roman" w:cs="Times New Roman"/>
+          <w:color w:val="000000"/>
+          <w:sz w:val="24"/>
+          <w:szCs w:val="24"/>
+        </w:rPr>
+        <w:t>́</w:t>
+      </w:r>
+      <w:r>
+        <w:rPr>
+          <w:rFonts w:ascii="Times New Roman" w:hAnsi="Times New Roman" w:cs="Times New Roman"/>
+          <w:sz w:val="24"/>
+          <w:szCs w:val="24"/>
+        </w:rPr>
+        <w:t>д поверну</w:t>
+      </w:r>
+      <w:r>
+        <w:rPr>
+          <w:rFonts w:ascii="Times New Roman" w:eastAsia="Gentium Plus" w:hAnsi="Times New Roman" w:cs="Times New Roman"/>
+          <w:color w:val="000000"/>
+          <w:sz w:val="24"/>
+          <w:szCs w:val="24"/>
+        </w:rPr>
+        <w:t>́</w:t>
+      </w:r>
+      <w:r>
+        <w:rPr>
+          <w:rFonts w:ascii="Times New Roman" w:hAnsi="Times New Roman" w:cs="Times New Roman"/>
+          <w:sz w:val="24"/>
+          <w:szCs w:val="24"/>
+        </w:rPr>
+        <w:t>вся?</w:t>
+      </w:r>
+    </w:p>
+    <w:p>
+      <w:pPr>
+        <w:pStyle w:val="Heading3"/>
+        <w:spacing w:before="0" w:after="120"/>
+        <w:jc w:val="center"/>
+        <w:rPr>
+          <w:rFonts w:ascii="Times New Roman" w:hAnsi="Times New Roman" w:cs="Times New Roman"/>
+          <w:b/>
+          <w:bCs/>
+          <w:i/>
+          <w:iCs/>
+          <w:color w:val="FF0000"/>
+        </w:rPr>
+      </w:pPr>
+      <w:r>
+        <w:rPr>
+          <w:rFonts w:ascii="Times New Roman" w:hAnsi="Times New Roman" w:cs="Times New Roman"/>
+          <w:b/>
+          <w:bCs/>
+          <w:i/>
+          <w:iCs/>
+          <w:color w:val="FF0000"/>
+        </w:rPr>
+        <w:t>Прокімен</w:t>
+      </w:r>
+    </w:p>
+    <w:p>
+      <w:pPr>
+        <w:jc w:val="center"/>
+        <w:rPr>
+          <w:rFonts w:ascii="Times New Roman" w:hAnsi="Times New Roman" w:cs="Times New Roman"/>
+          <w:i/>
+          <w:iCs/>
+          <w:color w:val="FF0000"/>
+          <w:sz w:val="24"/>
+          <w:szCs w:val="24"/>
+        </w:rPr>
+      </w:pPr>
+      <w:r>
+        <w:rPr>
+          <w:rFonts w:ascii="Times New Roman" w:hAnsi="Times New Roman" w:cs="Times New Roman"/>
+          <w:i/>
+          <w:iCs/>
+          <w:color w:val="FF0000"/>
+          <w:sz w:val="24"/>
+          <w:szCs w:val="24"/>
+        </w:rPr>
+        <w:t>Псалом 76</w:t>
+      </w:r>
+    </w:p>
+    <w:p>
+      <w:pPr>
+        <w:rPr>
+          <w:rFonts w:ascii="Times New Roman" w:hAnsi="Times New Roman" w:cs="Times New Roman"/>
+          <w:b/>
+          <w:bCs/>
+          <w:sz w:val="24"/>
+          <w:szCs w:val="24"/>
+          <w:shd w:val="clear" w:color="auto" w:fill="FFFF00"/>
+        </w:rPr>
+      </w:pPr>
+      <w:r>
+        <w:rPr>
+          <w:rFonts w:ascii="Times New Roman" w:hAnsi="Times New Roman" w:cs="Times New Roman"/>
+          <w:i/>
+          <w:iCs/>
+          <w:color w:val="FF0000"/>
+          <w:sz w:val="24"/>
+          <w:szCs w:val="24"/>
+        </w:rPr>
+        <w:t>(г. 8)</w:t>
+      </w:r>
+      <w:r>
+        <w:rPr>
+          <w:rFonts w:ascii="Times New Roman" w:hAnsi="Times New Roman" w:cs="Times New Roman"/>
+          <w:i/>
+          <w:iCs/>
+          <w:color w:val="FF0000"/>
+          <w:sz w:val="24"/>
+          <w:szCs w:val="24"/>
+        </w:rPr>
+        <w:t xml:space="preserve">: </w:t>
+      </w:r>
+      <w:r>
+        <w:rPr>
+          <w:rFonts w:ascii="Times New Roman" w:hAnsi="Times New Roman" w:cs="Times New Roman"/>
+          <w:b/>
+          <w:bCs/>
+          <w:sz w:val="24"/>
+          <w:szCs w:val="24"/>
+        </w:rPr>
+        <w:t>Го</w:t>
+      </w:r>
+      <w:r>
+        <w:rPr>
+          <w:rFonts w:ascii="Times New Roman" w:eastAsia="Gentium Plus" w:hAnsi="Times New Roman" w:cs="Times New Roman"/>
+          <w:b/>
+          <w:bCs/>
+          <w:color w:val="000000"/>
+          <w:sz w:val="24"/>
+          <w:szCs w:val="24"/>
+        </w:rPr>
+        <w:t>́</w:t>
+      </w:r>
+      <w:r>
+        <w:rPr>
+          <w:rFonts w:ascii="Times New Roman" w:hAnsi="Times New Roman" w:cs="Times New Roman"/>
+          <w:b/>
+          <w:bCs/>
+          <w:sz w:val="24"/>
+          <w:szCs w:val="24"/>
+        </w:rPr>
+        <w:t>лосом мо</w:t>
+      </w:r>
+      <w:r>
+        <w:rPr>
+          <w:rFonts w:ascii="Times New Roman" w:eastAsia="Gentium Plus" w:hAnsi="Times New Roman" w:cs="Times New Roman"/>
+          <w:b/>
+          <w:bCs/>
+          <w:color w:val="000000"/>
+          <w:sz w:val="24"/>
+          <w:szCs w:val="24"/>
+        </w:rPr>
+        <w:t>ї́</w:t>
+      </w:r>
+      <w:r>
+        <w:rPr>
+          <w:rFonts w:ascii="Times New Roman" w:hAnsi="Times New Roman" w:cs="Times New Roman"/>
+          <w:b/>
+          <w:bCs/>
+          <w:sz w:val="24"/>
+          <w:szCs w:val="24"/>
+        </w:rPr>
+        <w:t>м до Го</w:t>
+      </w:r>
+      <w:r>
+        <w:rPr>
+          <w:rFonts w:ascii="Times New Roman" w:eastAsia="Gentium Plus" w:hAnsi="Times New Roman" w:cs="Times New Roman"/>
+          <w:b/>
+          <w:bCs/>
+          <w:color w:val="000000"/>
+          <w:sz w:val="24"/>
+          <w:szCs w:val="24"/>
+        </w:rPr>
+        <w:t>́</w:t>
+      </w:r>
+      <w:r>
+        <w:rPr>
+          <w:rFonts w:ascii="Times New Roman" w:hAnsi="Times New Roman" w:cs="Times New Roman"/>
+          <w:b/>
+          <w:bCs/>
+          <w:sz w:val="24"/>
+          <w:szCs w:val="24"/>
+        </w:rPr>
+        <w:t>спода я кли</w:t>
+      </w:r>
+      <w:r>
+        <w:rPr>
+          <w:rFonts w:ascii="Times New Roman" w:eastAsia="Gentium Plus" w:hAnsi="Times New Roman" w:cs="Times New Roman"/>
+          <w:b/>
+          <w:bCs/>
+          <w:color w:val="000000"/>
+          <w:sz w:val="24"/>
+          <w:szCs w:val="24"/>
+        </w:rPr>
+        <w:t>́</w:t>
+      </w:r>
+      <w:r>
+        <w:rPr>
+          <w:rFonts w:ascii="Times New Roman" w:hAnsi="Times New Roman" w:cs="Times New Roman"/>
+          <w:b/>
+          <w:bCs/>
+          <w:sz w:val="24"/>
+          <w:szCs w:val="24"/>
+        </w:rPr>
+        <w:t>кав,* і го</w:t>
+      </w:r>
+      <w:r>
+        <w:rPr>
+          <w:rFonts w:ascii="Times New Roman" w:eastAsia="Gentium Plus" w:hAnsi="Times New Roman" w:cs="Times New Roman"/>
+          <w:b/>
+          <w:bCs/>
+          <w:color w:val="000000"/>
+          <w:sz w:val="24"/>
+          <w:szCs w:val="24"/>
+        </w:rPr>
+        <w:t>́</w:t>
+      </w:r>
+      <w:r>
+        <w:rPr>
+          <w:rFonts w:ascii="Times New Roman" w:hAnsi="Times New Roman" w:cs="Times New Roman"/>
+          <w:b/>
+          <w:bCs/>
+          <w:sz w:val="24"/>
+          <w:szCs w:val="24"/>
+        </w:rPr>
+        <w:t>лос мій дійшо</w:t>
+      </w:r>
+      <w:r>
+        <w:rPr>
+          <w:rFonts w:ascii="Times New Roman" w:eastAsia="Gentium Plus" w:hAnsi="Times New Roman" w:cs="Times New Roman"/>
+          <w:b/>
+          <w:bCs/>
+          <w:color w:val="000000"/>
+          <w:sz w:val="24"/>
+          <w:szCs w:val="24"/>
+        </w:rPr>
+        <w:t>́</w:t>
+      </w:r>
+      <w:r>
+        <w:rPr>
+          <w:rFonts w:ascii="Times New Roman" w:hAnsi="Times New Roman" w:cs="Times New Roman"/>
+          <w:b/>
+          <w:bCs/>
+          <w:sz w:val="24"/>
+          <w:szCs w:val="24"/>
+        </w:rPr>
+        <w:t>в до Бо</w:t>
+      </w:r>
+      <w:r>
+        <w:rPr>
+          <w:rFonts w:ascii="Times New Roman" w:eastAsia="Gentium Plus" w:hAnsi="Times New Roman" w:cs="Times New Roman"/>
+          <w:b/>
+          <w:bCs/>
+          <w:color w:val="000000"/>
+          <w:sz w:val="24"/>
+          <w:szCs w:val="24"/>
+        </w:rPr>
+        <w:t>́</w:t>
+      </w:r>
+      <w:r>
+        <w:rPr>
+          <w:rFonts w:ascii="Times New Roman" w:hAnsi="Times New Roman" w:cs="Times New Roman"/>
+          <w:b/>
+          <w:bCs/>
+          <w:sz w:val="24"/>
+          <w:szCs w:val="24"/>
+        </w:rPr>
+        <w:t>га, і Він ви</w:t>
+      </w:r>
+      <w:r>
+        <w:rPr>
+          <w:rFonts w:ascii="Times New Roman" w:eastAsia="Gentium Plus" w:hAnsi="Times New Roman" w:cs="Times New Roman"/>
+          <w:b/>
+          <w:bCs/>
+          <w:color w:val="000000"/>
+          <w:sz w:val="24"/>
+          <w:szCs w:val="24"/>
+        </w:rPr>
+        <w:t>́</w:t>
+      </w:r>
+      <w:r>
+        <w:rPr>
+          <w:rFonts w:ascii="Times New Roman" w:hAnsi="Times New Roman" w:cs="Times New Roman"/>
+          <w:b/>
+          <w:bCs/>
+          <w:sz w:val="24"/>
+          <w:szCs w:val="24"/>
+        </w:rPr>
+        <w:t>слухав мене</w:t>
+      </w:r>
+      <w:r>
+        <w:rPr>
+          <w:rFonts w:ascii="Times New Roman" w:eastAsia="Gentium Plus" w:hAnsi="Times New Roman" w:cs="Times New Roman"/>
+          <w:b/>
+          <w:bCs/>
+          <w:color w:val="000000"/>
+          <w:sz w:val="24"/>
+          <w:szCs w:val="24"/>
+        </w:rPr>
+        <w:t>́</w:t>
+      </w:r>
+      <w:r>
+        <w:rPr>
+          <w:rFonts w:ascii="Times New Roman" w:hAnsi="Times New Roman" w:cs="Times New Roman"/>
+          <w:b/>
+          <w:bCs/>
+          <w:sz w:val="24"/>
+          <w:szCs w:val="24"/>
+        </w:rPr>
+        <w:t>.</w:t>
+      </w:r>
+    </w:p>
+    <w:p>
+      <w:pPr>
+        <w:rPr>
+          <w:rFonts w:ascii="Times New Roman" w:hAnsi="Times New Roman" w:cs="Times New Roman"/>
+          <w:sz w:val="24"/>
+          <w:szCs w:val="24"/>
+        </w:rPr>
+      </w:pPr>
+      <w:r>
+        <w:rPr>
+          <w:rFonts w:ascii="Times New Roman" w:hAnsi="Times New Roman" w:cs="Times New Roman"/>
+          <w:i/>
+          <w:color w:val="FF0000"/>
+          <w:sz w:val="24"/>
+          <w:szCs w:val="24"/>
+        </w:rPr>
+        <w:t xml:space="preserve">Стих: </w:t>
+      </w:r>
+      <w:r>
+        <w:rPr>
+          <w:rFonts w:ascii="Times New Roman" w:hAnsi="Times New Roman" w:cs="Times New Roman"/>
+          <w:sz w:val="24"/>
+          <w:szCs w:val="24"/>
+        </w:rPr>
+        <w:t>У день журби</w:t>
+      </w:r>
+      <w:r>
+        <w:rPr>
+          <w:rFonts w:ascii="Times New Roman" w:eastAsia="Gentium Plus" w:hAnsi="Times New Roman" w:cs="Times New Roman"/>
+          <w:color w:val="000000"/>
+          <w:sz w:val="24"/>
+          <w:szCs w:val="24"/>
+        </w:rPr>
+        <w:t>́</w:t>
+      </w:r>
+      <w:r>
+        <w:rPr>
+          <w:rFonts w:ascii="Times New Roman" w:hAnsi="Times New Roman" w:cs="Times New Roman"/>
+          <w:sz w:val="24"/>
+          <w:szCs w:val="24"/>
+        </w:rPr>
+        <w:t xml:space="preserve"> моє</w:t>
+      </w:r>
+      <w:r>
+        <w:rPr>
+          <w:rFonts w:ascii="Times New Roman" w:eastAsia="Gentium Plus" w:hAnsi="Times New Roman" w:cs="Times New Roman"/>
+          <w:color w:val="000000"/>
+          <w:sz w:val="24"/>
+          <w:szCs w:val="24"/>
+        </w:rPr>
+        <w:t>́</w:t>
+      </w:r>
+      <w:r>
+        <w:rPr>
+          <w:rFonts w:ascii="Times New Roman" w:hAnsi="Times New Roman" w:cs="Times New Roman"/>
+          <w:sz w:val="24"/>
+          <w:szCs w:val="24"/>
+        </w:rPr>
+        <w:t>ї шука</w:t>
+      </w:r>
+      <w:r>
+        <w:rPr>
+          <w:rFonts w:ascii="Times New Roman" w:eastAsia="Gentium Plus" w:hAnsi="Times New Roman" w:cs="Times New Roman"/>
+          <w:color w:val="000000"/>
+          <w:sz w:val="24"/>
+          <w:szCs w:val="24"/>
+        </w:rPr>
+        <w:t>́</w:t>
+      </w:r>
+      <w:r>
+        <w:rPr>
+          <w:rFonts w:ascii="Times New Roman" w:hAnsi="Times New Roman" w:cs="Times New Roman"/>
+          <w:sz w:val="24"/>
+          <w:szCs w:val="24"/>
+        </w:rPr>
+        <w:t>ю я Бо</w:t>
+      </w:r>
+      <w:r>
+        <w:rPr>
+          <w:rFonts w:ascii="Times New Roman" w:eastAsia="Gentium Plus" w:hAnsi="Times New Roman" w:cs="Times New Roman"/>
+          <w:color w:val="000000"/>
+          <w:sz w:val="24"/>
+          <w:szCs w:val="24"/>
+        </w:rPr>
+        <w:t>́</w:t>
+      </w:r>
+      <w:r>
+        <w:rPr>
+          <w:rFonts w:ascii="Times New Roman" w:hAnsi="Times New Roman" w:cs="Times New Roman"/>
+          <w:sz w:val="24"/>
+          <w:szCs w:val="24"/>
+        </w:rPr>
+        <w:t>га.</w:t>
+      </w:r>
+    </w:p>
+    <w:p>
+      <w:pPr>
+        <w:rPr>
+          <w:rFonts w:ascii="Times New Roman" w:hAnsi="Times New Roman" w:cs="Times New Roman"/>
+          <w:sz w:val="24"/>
+          <w:szCs w:val="24"/>
+        </w:rPr>
+      </w:pPr>
+      <w:r>
+        <w:rPr>
+          <w:rFonts w:ascii="Times New Roman" w:hAnsi="Times New Roman" w:cs="Times New Roman"/>
+          <w:i/>
+          <w:color w:val="FF0000"/>
+          <w:sz w:val="24"/>
+          <w:szCs w:val="24"/>
+        </w:rPr>
+        <w:t xml:space="preserve">Стих: </w:t>
+      </w:r>
+      <w:r>
+        <w:rPr>
+          <w:rFonts w:ascii="Times New Roman" w:hAnsi="Times New Roman" w:cs="Times New Roman"/>
+          <w:sz w:val="24"/>
+          <w:szCs w:val="24"/>
+        </w:rPr>
+        <w:t>Відмо</w:t>
+      </w:r>
+      <w:r>
+        <w:rPr>
+          <w:rFonts w:ascii="Times New Roman" w:eastAsia="Gentium Plus" w:hAnsi="Times New Roman" w:cs="Times New Roman"/>
+          <w:color w:val="000000"/>
+          <w:sz w:val="24"/>
+          <w:szCs w:val="24"/>
+        </w:rPr>
+        <w:t>́</w:t>
+      </w:r>
+      <w:r>
+        <w:rPr>
+          <w:rFonts w:ascii="Times New Roman" w:hAnsi="Times New Roman" w:cs="Times New Roman"/>
+          <w:sz w:val="24"/>
+          <w:szCs w:val="24"/>
+        </w:rPr>
+        <w:t>вилась від поті́хи душа</w:t>
+      </w:r>
+      <w:r>
+        <w:rPr>
+          <w:rFonts w:ascii="Times New Roman" w:eastAsia="Gentium Plus" w:hAnsi="Times New Roman" w:cs="Times New Roman"/>
+          <w:color w:val="000000"/>
+          <w:sz w:val="24"/>
+          <w:szCs w:val="24"/>
+        </w:rPr>
+        <w:t>́</w:t>
+      </w:r>
+      <w:r>
+        <w:rPr>
+          <w:rFonts w:ascii="Times New Roman" w:hAnsi="Times New Roman" w:cs="Times New Roman"/>
+          <w:sz w:val="24"/>
+          <w:szCs w:val="24"/>
+        </w:rPr>
+        <w:t xml:space="preserve"> моя</w:t>
+      </w:r>
+      <w:r>
+        <w:rPr>
+          <w:rFonts w:ascii="Times New Roman" w:eastAsia="Gentium Plus" w:hAnsi="Times New Roman" w:cs="Times New Roman"/>
+          <w:color w:val="000000"/>
+          <w:sz w:val="24"/>
+          <w:szCs w:val="24"/>
+        </w:rPr>
+        <w:t>́</w:t>
+      </w:r>
+      <w:r>
+        <w:rPr>
+          <w:rFonts w:ascii="Times New Roman" w:hAnsi="Times New Roman" w:cs="Times New Roman"/>
+          <w:sz w:val="24"/>
+          <w:szCs w:val="24"/>
+        </w:rPr>
+        <w:t>.</w:t>
+      </w:r>
+    </w:p>
+    <w:p>
+      <w:pPr>
+        <w:rPr>
+          <w:rFonts w:ascii="Times New Roman" w:hAnsi="Times New Roman" w:cs="Times New Roman"/>
+          <w:sz w:val="24"/>
+          <w:szCs w:val="24"/>
+        </w:rPr>
+      </w:pPr>
+      <w:r>
+        <w:rPr>
+          <w:rFonts w:ascii="Times New Roman" w:hAnsi="Times New Roman" w:cs="Times New Roman"/>
+          <w:i/>
+          <w:color w:val="FF0000"/>
+          <w:sz w:val="24"/>
+          <w:szCs w:val="24"/>
+        </w:rPr>
+        <w:t xml:space="preserve">Стих: </w:t>
+      </w:r>
+      <w:r>
+        <w:rPr>
+          <w:rFonts w:ascii="Times New Roman" w:hAnsi="Times New Roman" w:cs="Times New Roman"/>
+          <w:sz w:val="24"/>
+          <w:szCs w:val="24"/>
+        </w:rPr>
+        <w:t>Бо</w:t>
+      </w:r>
+      <w:r>
+        <w:rPr>
+          <w:rFonts w:ascii="Times New Roman" w:eastAsia="Gentium Plus" w:hAnsi="Times New Roman" w:cs="Times New Roman"/>
+          <w:color w:val="000000"/>
+          <w:sz w:val="24"/>
+          <w:szCs w:val="24"/>
+        </w:rPr>
+        <w:t>́</w:t>
+      </w:r>
+      <w:r>
+        <w:rPr>
+          <w:rFonts w:ascii="Times New Roman" w:hAnsi="Times New Roman" w:cs="Times New Roman"/>
+          <w:sz w:val="24"/>
+          <w:szCs w:val="24"/>
+        </w:rPr>
+        <w:t>же, у свя</w:t>
+      </w:r>
+      <w:r>
+        <w:rPr>
+          <w:rFonts w:ascii="Times New Roman" w:eastAsia="Gentium Plus" w:hAnsi="Times New Roman" w:cs="Times New Roman"/>
+          <w:color w:val="000000"/>
+          <w:sz w:val="24"/>
+          <w:szCs w:val="24"/>
+        </w:rPr>
+        <w:t>́</w:t>
+      </w:r>
+      <w:r>
+        <w:rPr>
+          <w:rFonts w:ascii="Times New Roman" w:hAnsi="Times New Roman" w:cs="Times New Roman"/>
+          <w:sz w:val="24"/>
+          <w:szCs w:val="24"/>
+        </w:rPr>
+        <w:t>тості доро</w:t>
+      </w:r>
+      <w:r>
+        <w:rPr>
+          <w:rFonts w:ascii="Times New Roman" w:eastAsia="Gentium Plus" w:hAnsi="Times New Roman" w:cs="Times New Roman"/>
+          <w:color w:val="000000"/>
+          <w:sz w:val="24"/>
+          <w:szCs w:val="24"/>
+        </w:rPr>
+        <w:t>́</w:t>
+      </w:r>
+      <w:r>
+        <w:rPr>
+          <w:rFonts w:ascii="Times New Roman" w:hAnsi="Times New Roman" w:cs="Times New Roman"/>
+          <w:sz w:val="24"/>
+          <w:szCs w:val="24"/>
+        </w:rPr>
+        <w:t>га Твоя</w:t>
+      </w:r>
+      <w:r>
+        <w:rPr>
+          <w:rFonts w:ascii="Times New Roman" w:eastAsia="Gentium Plus" w:hAnsi="Times New Roman" w:cs="Times New Roman"/>
+          <w:color w:val="000000"/>
+          <w:sz w:val="24"/>
+          <w:szCs w:val="24"/>
+        </w:rPr>
+        <w:t>́</w:t>
+      </w:r>
+      <w:r>
+        <w:rPr>
+          <w:rFonts w:ascii="Times New Roman" w:hAnsi="Times New Roman" w:cs="Times New Roman"/>
+          <w:sz w:val="24"/>
+          <w:szCs w:val="24"/>
+        </w:rPr>
+        <w:t>.</w:t>
+      </w:r>
+    </w:p>
+    <w:p>
+      <w:pPr>
+        <w:pStyle w:val="Heading3"/>
+        <w:spacing w:before="0" w:after="120"/>
+        <w:jc w:val="center"/>
+        <w:rPr>
+          <w:rFonts w:ascii="Times New Roman" w:hAnsi="Times New Roman" w:cs="Times New Roman"/>
+          <w:b/>
+          <w:bCs/>
+          <w:i/>
+          <w:iCs/>
+          <w:color w:val="FF0000"/>
+        </w:rPr>
+      </w:pPr>
+      <w:r>
+        <w:rPr>
+          <w:rFonts w:ascii="Times New Roman" w:hAnsi="Times New Roman" w:cs="Times New Roman"/>
+          <w:b/>
+          <w:bCs/>
+          <w:i/>
+          <w:iCs/>
+          <w:color w:val="FF0000"/>
+        </w:rPr>
+        <w:t>Прокімен</w:t>
+      </w:r>
+    </w:p>
+    <w:p>
+      <w:pPr>
+        <w:jc w:val="center"/>
+        <w:rPr>
+          <w:rFonts w:ascii="Times New Roman" w:hAnsi="Times New Roman" w:cs="Times New Roman"/>
+          <w:i/>
+          <w:iCs/>
+          <w:color w:val="FF0000"/>
+          <w:sz w:val="24"/>
+          <w:szCs w:val="24"/>
+        </w:rPr>
+      </w:pPr>
+      <w:r>
+        <w:rPr>
+          <w:rFonts w:ascii="Times New Roman" w:hAnsi="Times New Roman" w:cs="Times New Roman"/>
+          <w:i/>
+          <w:iCs/>
+          <w:color w:val="FF0000"/>
+          <w:sz w:val="24"/>
+          <w:szCs w:val="24"/>
+        </w:rPr>
+        <w:t>Псалом 54</w:t>
+      </w:r>
+    </w:p>
+    <w:p>
+      <w:pPr>
+        <w:rPr>
+          <w:rFonts w:ascii="Times New Roman" w:hAnsi="Times New Roman" w:cs="Times New Roman"/>
+          <w:b/>
+          <w:bCs/>
+          <w:sz w:val="24"/>
+          <w:szCs w:val="24"/>
+          <w:shd w:val="clear" w:color="auto" w:fill="FFFF00"/>
+        </w:rPr>
+      </w:pPr>
+      <w:r>
+        <w:rPr>
+          <w:rFonts w:ascii="Times New Roman" w:hAnsi="Times New Roman" w:cs="Times New Roman"/>
+          <w:i/>
+          <w:iCs/>
+          <w:color w:val="FF0000"/>
+          <w:sz w:val="24"/>
+          <w:szCs w:val="24"/>
+        </w:rPr>
+        <w:t xml:space="preserve">(г. </w:t>
+      </w:r>
+      <w:r>
+        <w:rPr>
+          <w:rFonts w:ascii="Times New Roman" w:hAnsi="Times New Roman" w:cs="Times New Roman"/>
+          <w:i/>
+          <w:iCs/>
+          <w:color w:val="FF0000"/>
+          <w:sz w:val="24"/>
+          <w:szCs w:val="24"/>
+        </w:rPr>
+        <w:t>7</w:t>
+      </w:r>
+      <w:r>
+        <w:rPr>
+          <w:rFonts w:ascii="Times New Roman" w:hAnsi="Times New Roman" w:cs="Times New Roman"/>
+          <w:i/>
+          <w:iCs/>
+          <w:color w:val="FF0000"/>
+          <w:sz w:val="24"/>
+          <w:szCs w:val="24"/>
+        </w:rPr>
+        <w:t>)</w:t>
+      </w:r>
+      <w:r>
+        <w:rPr>
+          <w:rFonts w:ascii="Times New Roman" w:hAnsi="Times New Roman" w:cs="Times New Roman"/>
+          <w:i/>
+          <w:iCs/>
+          <w:color w:val="FF0000"/>
+          <w:sz w:val="24"/>
+          <w:szCs w:val="24"/>
+        </w:rPr>
+        <w:t xml:space="preserve">: </w:t>
+      </w:r>
+      <w:r>
+        <w:rPr>
+          <w:rFonts w:ascii="Times New Roman" w:hAnsi="Times New Roman" w:cs="Times New Roman"/>
+          <w:b/>
+          <w:bCs/>
+          <w:sz w:val="24"/>
+          <w:szCs w:val="24"/>
+        </w:rPr>
+        <w:t>Ви</w:t>
+      </w:r>
+      <w:r>
+        <w:rPr>
+          <w:rFonts w:ascii="Times New Roman" w:eastAsia="Gentium Plus" w:hAnsi="Times New Roman" w:cs="Times New Roman"/>
+          <w:b/>
+          <w:bCs/>
+          <w:color w:val="000000"/>
+          <w:sz w:val="24"/>
+          <w:szCs w:val="24"/>
+        </w:rPr>
+        <w:t>́</w:t>
+      </w:r>
+      <w:r>
+        <w:rPr>
+          <w:rFonts w:ascii="Times New Roman" w:hAnsi="Times New Roman" w:cs="Times New Roman"/>
+          <w:b/>
+          <w:bCs/>
+          <w:sz w:val="24"/>
+          <w:szCs w:val="24"/>
+        </w:rPr>
+        <w:t>слухай, Бо</w:t>
+      </w:r>
+      <w:r>
+        <w:rPr>
+          <w:rFonts w:ascii="Times New Roman" w:eastAsia="Gentium Plus" w:hAnsi="Times New Roman" w:cs="Times New Roman"/>
+          <w:b/>
+          <w:bCs/>
+          <w:color w:val="000000"/>
+          <w:sz w:val="24"/>
+          <w:szCs w:val="24"/>
+        </w:rPr>
+        <w:t>́</w:t>
+      </w:r>
+      <w:r>
+        <w:rPr>
+          <w:rFonts w:ascii="Times New Roman" w:hAnsi="Times New Roman" w:cs="Times New Roman"/>
+          <w:b/>
+          <w:bCs/>
+          <w:sz w:val="24"/>
+          <w:szCs w:val="24"/>
+        </w:rPr>
+        <w:t>же, моли</w:t>
+      </w:r>
+      <w:r>
+        <w:rPr>
+          <w:rFonts w:ascii="Times New Roman" w:eastAsia="Gentium Plus" w:hAnsi="Times New Roman" w:cs="Times New Roman"/>
+          <w:b/>
+          <w:bCs/>
+          <w:color w:val="000000"/>
+          <w:sz w:val="24"/>
+          <w:szCs w:val="24"/>
+        </w:rPr>
+        <w:t>́</w:t>
+      </w:r>
+      <w:r>
+        <w:rPr>
+          <w:rFonts w:ascii="Times New Roman" w:hAnsi="Times New Roman" w:cs="Times New Roman"/>
+          <w:b/>
+          <w:bCs/>
+          <w:sz w:val="24"/>
+          <w:szCs w:val="24"/>
+        </w:rPr>
+        <w:t>тву мою</w:t>
+      </w:r>
+      <w:r>
+        <w:rPr>
+          <w:rFonts w:ascii="Times New Roman" w:eastAsia="Gentium Plus" w:hAnsi="Times New Roman" w:cs="Times New Roman"/>
+          <w:b/>
+          <w:bCs/>
+          <w:color w:val="000000"/>
+          <w:sz w:val="24"/>
+          <w:szCs w:val="24"/>
+        </w:rPr>
+        <w:t>́</w:t>
+      </w:r>
+      <w:r>
+        <w:rPr>
+          <w:rFonts w:ascii="Times New Roman" w:hAnsi="Times New Roman" w:cs="Times New Roman"/>
+          <w:b/>
+          <w:bCs/>
+          <w:sz w:val="24"/>
+          <w:szCs w:val="24"/>
+        </w:rPr>
+        <w:t>* і не погорди</w:t>
+      </w:r>
+      <w:r>
+        <w:rPr>
+          <w:rFonts w:ascii="Times New Roman" w:eastAsia="Gentium Plus" w:hAnsi="Times New Roman" w:cs="Times New Roman"/>
+          <w:b/>
+          <w:bCs/>
+          <w:color w:val="000000"/>
+          <w:sz w:val="24"/>
+          <w:szCs w:val="24"/>
+        </w:rPr>
+        <w:t>́</w:t>
+      </w:r>
+      <w:r>
+        <w:rPr>
+          <w:rFonts w:ascii="Times New Roman" w:hAnsi="Times New Roman" w:cs="Times New Roman"/>
+          <w:b/>
+          <w:bCs/>
+          <w:sz w:val="24"/>
+          <w:szCs w:val="24"/>
+        </w:rPr>
+        <w:t xml:space="preserve"> блага</w:t>
+      </w:r>
+      <w:r>
+        <w:rPr>
+          <w:rFonts w:ascii="Times New Roman" w:eastAsia="Gentium Plus" w:hAnsi="Times New Roman" w:cs="Times New Roman"/>
+          <w:b/>
+          <w:bCs/>
+          <w:color w:val="000000"/>
+          <w:sz w:val="24"/>
+          <w:szCs w:val="24"/>
+        </w:rPr>
+        <w:t>́</w:t>
+      </w:r>
+      <w:r>
+        <w:rPr>
+          <w:rFonts w:ascii="Times New Roman" w:hAnsi="Times New Roman" w:cs="Times New Roman"/>
+          <w:b/>
+          <w:bCs/>
+          <w:sz w:val="24"/>
+          <w:szCs w:val="24"/>
+        </w:rPr>
+        <w:t>нням мо</w:t>
+      </w:r>
+      <w:r>
+        <w:rPr>
+          <w:rFonts w:ascii="Times New Roman" w:eastAsia="Gentium Plus" w:hAnsi="Times New Roman" w:cs="Times New Roman"/>
+          <w:b/>
+          <w:bCs/>
+          <w:color w:val="000000"/>
+          <w:sz w:val="24"/>
+          <w:szCs w:val="24"/>
+        </w:rPr>
+        <w:t>ї́</w:t>
+      </w:r>
+      <w:r>
+        <w:rPr>
+          <w:rFonts w:ascii="Times New Roman" w:hAnsi="Times New Roman" w:cs="Times New Roman"/>
+          <w:b/>
+          <w:bCs/>
+          <w:sz w:val="24"/>
+          <w:szCs w:val="24"/>
+        </w:rPr>
+        <w:t>м.</w:t>
+      </w:r>
+    </w:p>
+    <w:p>
+      <w:pPr>
+        <w:rPr>
+          <w:rFonts w:ascii="Times New Roman" w:hAnsi="Times New Roman" w:cs="Times New Roman"/>
+          <w:sz w:val="24"/>
+          <w:szCs w:val="24"/>
+        </w:rPr>
+      </w:pPr>
+      <w:r>
+        <w:rPr>
+          <w:rFonts w:ascii="Times New Roman" w:hAnsi="Times New Roman" w:cs="Times New Roman"/>
+          <w:i/>
+          <w:color w:val="FF0000"/>
+          <w:sz w:val="24"/>
+          <w:szCs w:val="24"/>
+        </w:rPr>
+        <w:t xml:space="preserve">Стих: </w:t>
+      </w:r>
+      <w:r>
+        <w:rPr>
+          <w:rFonts w:ascii="Times New Roman" w:hAnsi="Times New Roman" w:cs="Times New Roman"/>
+          <w:sz w:val="24"/>
+          <w:szCs w:val="24"/>
+        </w:rPr>
+        <w:t>Зверни</w:t>
+      </w:r>
+      <w:r>
+        <w:rPr>
+          <w:rFonts w:ascii="Times New Roman" w:eastAsia="Gentium Plus" w:hAnsi="Times New Roman" w:cs="Times New Roman"/>
+          <w:color w:val="000000"/>
+          <w:sz w:val="24"/>
+          <w:szCs w:val="24"/>
+        </w:rPr>
+        <w:t>́</w:t>
+      </w:r>
+      <w:r>
+        <w:rPr>
+          <w:rFonts w:ascii="Times New Roman" w:hAnsi="Times New Roman" w:cs="Times New Roman"/>
+          <w:sz w:val="24"/>
+          <w:szCs w:val="24"/>
+        </w:rPr>
+        <w:t xml:space="preserve"> ува</w:t>
+      </w:r>
+      <w:r>
+        <w:rPr>
+          <w:rFonts w:ascii="Times New Roman" w:eastAsia="Gentium Plus" w:hAnsi="Times New Roman" w:cs="Times New Roman"/>
+          <w:color w:val="000000"/>
+          <w:sz w:val="24"/>
+          <w:szCs w:val="24"/>
+        </w:rPr>
+        <w:t>́</w:t>
+      </w:r>
+      <w:r>
+        <w:rPr>
+          <w:rFonts w:ascii="Times New Roman" w:hAnsi="Times New Roman" w:cs="Times New Roman"/>
+          <w:sz w:val="24"/>
+          <w:szCs w:val="24"/>
+        </w:rPr>
+        <w:t>гу на ме</w:t>
+      </w:r>
+      <w:r>
+        <w:rPr>
+          <w:rFonts w:ascii="Times New Roman" w:eastAsia="Gentium Plus" w:hAnsi="Times New Roman" w:cs="Times New Roman"/>
+          <w:color w:val="000000"/>
+          <w:sz w:val="24"/>
+          <w:szCs w:val="24"/>
+        </w:rPr>
+        <w:t>́</w:t>
+      </w:r>
+      <w:r>
+        <w:rPr>
+          <w:rFonts w:ascii="Times New Roman" w:hAnsi="Times New Roman" w:cs="Times New Roman"/>
+          <w:sz w:val="24"/>
+          <w:szCs w:val="24"/>
+        </w:rPr>
+        <w:t>не та ви</w:t>
+      </w:r>
+      <w:r>
+        <w:rPr>
+          <w:rFonts w:ascii="Times New Roman" w:eastAsia="Gentium Plus" w:hAnsi="Times New Roman" w:cs="Times New Roman"/>
+          <w:color w:val="000000"/>
+          <w:sz w:val="24"/>
+          <w:szCs w:val="24"/>
+        </w:rPr>
+        <w:t>́</w:t>
+      </w:r>
+      <w:r>
+        <w:rPr>
+          <w:rFonts w:ascii="Times New Roman" w:hAnsi="Times New Roman" w:cs="Times New Roman"/>
+          <w:sz w:val="24"/>
+          <w:szCs w:val="24"/>
+        </w:rPr>
+        <w:t>слухай мене</w:t>
+      </w:r>
+      <w:r>
+        <w:rPr>
+          <w:rFonts w:ascii="Times New Roman" w:eastAsia="Gentium Plus" w:hAnsi="Times New Roman" w:cs="Times New Roman"/>
+          <w:color w:val="000000"/>
+          <w:sz w:val="24"/>
+          <w:szCs w:val="24"/>
+        </w:rPr>
+        <w:t>́</w:t>
+      </w:r>
+      <w:r>
+        <w:rPr>
+          <w:rFonts w:ascii="Times New Roman" w:hAnsi="Times New Roman" w:cs="Times New Roman"/>
+          <w:sz w:val="24"/>
+          <w:szCs w:val="24"/>
+        </w:rPr>
+        <w:t>.</w:t>
+      </w:r>
+    </w:p>
+    <w:p>
+      <w:pPr>
+        <w:rPr>
+          <w:rFonts w:ascii="Times New Roman" w:hAnsi="Times New Roman" w:cs="Times New Roman"/>
+          <w:sz w:val="24"/>
+          <w:szCs w:val="24"/>
+        </w:rPr>
+      </w:pPr>
+      <w:r>
+        <w:rPr>
+          <w:rFonts w:ascii="Times New Roman" w:hAnsi="Times New Roman" w:cs="Times New Roman"/>
+          <w:i/>
+          <w:color w:val="FF0000"/>
+          <w:sz w:val="24"/>
+          <w:szCs w:val="24"/>
+        </w:rPr>
+        <w:t xml:space="preserve">Стих: </w:t>
+      </w:r>
+      <w:r>
+        <w:rPr>
+          <w:rFonts w:ascii="Times New Roman" w:hAnsi="Times New Roman" w:cs="Times New Roman"/>
+          <w:sz w:val="24"/>
+          <w:szCs w:val="24"/>
+        </w:rPr>
+        <w:t>Бо звали</w:t>
+      </w:r>
+      <w:r>
+        <w:rPr>
+          <w:rFonts w:ascii="Times New Roman" w:eastAsia="Gentium Plus" w:hAnsi="Times New Roman" w:cs="Times New Roman"/>
+          <w:color w:val="000000"/>
+          <w:sz w:val="24"/>
+          <w:szCs w:val="24"/>
+        </w:rPr>
+        <w:t>́</w:t>
+      </w:r>
+      <w:r>
+        <w:rPr>
+          <w:rFonts w:ascii="Times New Roman" w:hAnsi="Times New Roman" w:cs="Times New Roman"/>
+          <w:sz w:val="24"/>
+          <w:szCs w:val="24"/>
+        </w:rPr>
+        <w:t>ли вони</w:t>
+      </w:r>
+      <w:r>
+        <w:rPr>
+          <w:rFonts w:ascii="Times New Roman" w:eastAsia="Gentium Plus" w:hAnsi="Times New Roman" w:cs="Times New Roman"/>
+          <w:color w:val="000000"/>
+          <w:sz w:val="24"/>
+          <w:szCs w:val="24"/>
+        </w:rPr>
+        <w:t>́</w:t>
+      </w:r>
+      <w:r>
+        <w:rPr>
+          <w:rFonts w:ascii="Times New Roman" w:hAnsi="Times New Roman" w:cs="Times New Roman"/>
+          <w:sz w:val="24"/>
+          <w:szCs w:val="24"/>
+        </w:rPr>
+        <w:t xml:space="preserve"> беззако</w:t>
+      </w:r>
+      <w:r>
+        <w:rPr>
+          <w:rFonts w:ascii="Times New Roman" w:eastAsia="Gentium Plus" w:hAnsi="Times New Roman" w:cs="Times New Roman"/>
+          <w:color w:val="000000"/>
+          <w:sz w:val="24"/>
+          <w:szCs w:val="24"/>
+        </w:rPr>
+        <w:t>́</w:t>
+      </w:r>
+      <w:r>
+        <w:rPr>
+          <w:rFonts w:ascii="Times New Roman" w:hAnsi="Times New Roman" w:cs="Times New Roman"/>
+          <w:sz w:val="24"/>
+          <w:szCs w:val="24"/>
+        </w:rPr>
+        <w:t>ння на ме</w:t>
+      </w:r>
+      <w:r>
+        <w:rPr>
+          <w:rFonts w:ascii="Times New Roman" w:eastAsia="Gentium Plus" w:hAnsi="Times New Roman" w:cs="Times New Roman"/>
+          <w:color w:val="000000"/>
+          <w:sz w:val="24"/>
+          <w:szCs w:val="24"/>
+        </w:rPr>
+        <w:t>́</w:t>
+      </w:r>
+      <w:r>
+        <w:rPr>
+          <w:rFonts w:ascii="Times New Roman" w:hAnsi="Times New Roman" w:cs="Times New Roman"/>
+          <w:sz w:val="24"/>
+          <w:szCs w:val="24"/>
+        </w:rPr>
+        <w:t>не.</w:t>
+      </w:r>
+    </w:p>
+    <w:p>
+      <w:pPr>
+        <w:rPr>
+          <w:rFonts w:ascii="Times New Roman" w:hAnsi="Times New Roman" w:cs="Times New Roman"/>
+          <w:sz w:val="24"/>
+          <w:szCs w:val="24"/>
+        </w:rPr>
+      </w:pPr>
+      <w:r>
+        <w:rPr>
+          <w:rFonts w:ascii="Times New Roman" w:hAnsi="Times New Roman" w:cs="Times New Roman"/>
+          <w:i/>
+          <w:color w:val="FF0000"/>
+          <w:sz w:val="24"/>
+          <w:szCs w:val="24"/>
+        </w:rPr>
+        <w:t xml:space="preserve">Стих: </w:t>
+      </w:r>
+      <w:r>
+        <w:rPr>
+          <w:rFonts w:ascii="Times New Roman" w:hAnsi="Times New Roman" w:cs="Times New Roman"/>
+          <w:sz w:val="24"/>
+          <w:szCs w:val="24"/>
+        </w:rPr>
+        <w:t>Я до Бо</w:t>
+      </w:r>
+      <w:r>
+        <w:rPr>
+          <w:rFonts w:ascii="Times New Roman" w:eastAsia="Gentium Plus" w:hAnsi="Times New Roman" w:cs="Times New Roman"/>
+          <w:color w:val="000000"/>
+          <w:sz w:val="24"/>
+          <w:szCs w:val="24"/>
+        </w:rPr>
+        <w:t>́</w:t>
+      </w:r>
+      <w:r>
+        <w:rPr>
+          <w:rFonts w:ascii="Times New Roman" w:hAnsi="Times New Roman" w:cs="Times New Roman"/>
+          <w:sz w:val="24"/>
+          <w:szCs w:val="24"/>
+        </w:rPr>
+        <w:t>га взива</w:t>
+      </w:r>
+      <w:r>
+        <w:rPr>
+          <w:rFonts w:ascii="Times New Roman" w:eastAsia="Gentium Plus" w:hAnsi="Times New Roman" w:cs="Times New Roman"/>
+          <w:color w:val="000000"/>
+          <w:sz w:val="24"/>
+          <w:szCs w:val="24"/>
+        </w:rPr>
+        <w:t>́</w:t>
+      </w:r>
+      <w:r>
+        <w:rPr>
+          <w:rFonts w:ascii="Times New Roman" w:hAnsi="Times New Roman" w:cs="Times New Roman"/>
+          <w:sz w:val="24"/>
+          <w:szCs w:val="24"/>
+        </w:rPr>
+        <w:t>ю, і Госпо</w:t>
+      </w:r>
+      <w:r>
+        <w:rPr>
+          <w:rFonts w:ascii="Times New Roman" w:eastAsia="Gentium Plus" w:hAnsi="Times New Roman" w:cs="Times New Roman"/>
+          <w:color w:val="000000"/>
+          <w:sz w:val="24"/>
+          <w:szCs w:val="24"/>
+        </w:rPr>
+        <w:t>́</w:t>
+      </w:r>
+      <w:r>
+        <w:rPr>
+          <w:rFonts w:ascii="Times New Roman" w:hAnsi="Times New Roman" w:cs="Times New Roman"/>
+          <w:sz w:val="24"/>
+          <w:szCs w:val="24"/>
+        </w:rPr>
+        <w:t>дь ви</w:t>
+      </w:r>
+      <w:r>
+        <w:rPr>
+          <w:rFonts w:ascii="Times New Roman" w:eastAsia="Gentium Plus" w:hAnsi="Times New Roman" w:cs="Times New Roman"/>
+          <w:color w:val="000000"/>
+          <w:sz w:val="24"/>
+          <w:szCs w:val="24"/>
+        </w:rPr>
+        <w:t>́</w:t>
+      </w:r>
+      <w:r>
+        <w:rPr>
+          <w:rFonts w:ascii="Times New Roman" w:hAnsi="Times New Roman" w:cs="Times New Roman"/>
+          <w:sz w:val="24"/>
+          <w:szCs w:val="24"/>
+        </w:rPr>
+        <w:t>слухає мене</w:t>
+      </w:r>
+      <w:r>
+        <w:rPr>
+          <w:rFonts w:ascii="Times New Roman" w:eastAsia="Gentium Plus" w:hAnsi="Times New Roman" w:cs="Times New Roman"/>
+          <w:color w:val="000000"/>
+          <w:sz w:val="24"/>
+          <w:szCs w:val="24"/>
+        </w:rPr>
+        <w:t>́</w:t>
+      </w:r>
+      <w:r>
+        <w:rPr>
+          <w:rFonts w:ascii="Times New Roman" w:hAnsi="Times New Roman" w:cs="Times New Roman"/>
+          <w:sz w:val="24"/>
+          <w:szCs w:val="24"/>
+        </w:rPr>
+        <w:t>, уве</w:t>
+      </w:r>
+      <w:r>
+        <w:rPr>
+          <w:rFonts w:ascii="Times New Roman" w:eastAsia="Gentium Plus" w:hAnsi="Times New Roman" w:cs="Times New Roman"/>
+          <w:color w:val="000000"/>
+          <w:sz w:val="24"/>
+          <w:szCs w:val="24"/>
+        </w:rPr>
+        <w:t>́</w:t>
+      </w:r>
+      <w:r>
+        <w:rPr>
+          <w:rFonts w:ascii="Times New Roman" w:hAnsi="Times New Roman" w:cs="Times New Roman"/>
+          <w:sz w:val="24"/>
+          <w:szCs w:val="24"/>
+        </w:rPr>
+        <w:t>чері, вра</w:t>
+      </w:r>
+      <w:r>
+        <w:rPr>
+          <w:rFonts w:ascii="Times New Roman" w:eastAsia="Gentium Plus" w:hAnsi="Times New Roman" w:cs="Times New Roman"/>
+          <w:color w:val="000000"/>
+          <w:sz w:val="24"/>
+          <w:szCs w:val="24"/>
+        </w:rPr>
+        <w:t>́</w:t>
+      </w:r>
+      <w:r>
+        <w:rPr>
+          <w:rFonts w:ascii="Times New Roman" w:hAnsi="Times New Roman" w:cs="Times New Roman"/>
+          <w:sz w:val="24"/>
+          <w:szCs w:val="24"/>
+        </w:rPr>
+        <w:t>нці й опі́вдні.</w:t>
+      </w:r>
+    </w:p>
+    <w:p>
+      <w:pPr>
+        <w:pStyle w:val="Heading3"/>
+        <w:spacing w:before="0" w:after="120"/>
+        <w:jc w:val="center"/>
+        <w:rPr>
+          <w:rFonts w:ascii="Times New Roman" w:hAnsi="Times New Roman" w:cs="Times New Roman"/>
+          <w:b/>
+          <w:bCs/>
+          <w:i/>
+          <w:iCs/>
+          <w:color w:val="FF0000"/>
+        </w:rPr>
+      </w:pPr>
+      <w:r>
+        <w:rPr>
+          <w:rFonts w:ascii="Times New Roman" w:hAnsi="Times New Roman" w:cs="Times New Roman"/>
+          <w:b/>
+          <w:bCs/>
+          <w:i/>
+          <w:iCs/>
+          <w:color w:val="FF0000"/>
+        </w:rPr>
+        <w:t>Прокімен</w:t>
+      </w:r>
+    </w:p>
+    <w:p>
+      <w:pPr>
+        <w:jc w:val="center"/>
+        <w:rPr>
+          <w:rFonts w:ascii="Times New Roman" w:hAnsi="Times New Roman" w:cs="Times New Roman"/>
+          <w:i/>
+          <w:iCs/>
+          <w:color w:val="FF0000"/>
+          <w:sz w:val="24"/>
+          <w:szCs w:val="24"/>
+        </w:rPr>
+      </w:pPr>
+      <w:r>
+        <w:rPr>
+          <w:rFonts w:ascii="Times New Roman" w:hAnsi="Times New Roman" w:cs="Times New Roman"/>
+          <w:i/>
+          <w:iCs/>
+          <w:color w:val="FF0000"/>
+          <w:sz w:val="24"/>
+          <w:szCs w:val="24"/>
+        </w:rPr>
+        <w:t>Псалом 17</w:t>
+      </w:r>
+    </w:p>
+    <w:p>
+      <w:pPr>
+        <w:rPr>
+          <w:rFonts w:ascii="Times New Roman" w:hAnsi="Times New Roman" w:cs="Times New Roman"/>
+          <w:b/>
+          <w:bCs/>
+          <w:sz w:val="24"/>
+          <w:szCs w:val="24"/>
+        </w:rPr>
+      </w:pPr>
+      <w:r>
+        <w:rPr>
+          <w:rFonts w:ascii="Times New Roman" w:hAnsi="Times New Roman" w:cs="Times New Roman"/>
+          <w:i/>
+          <w:iCs/>
+          <w:color w:val="FF0000"/>
+          <w:sz w:val="24"/>
+          <w:szCs w:val="24"/>
+        </w:rPr>
+        <w:t xml:space="preserve">(г. </w:t>
+      </w:r>
+      <w:r>
+        <w:rPr>
+          <w:rFonts w:ascii="Times New Roman" w:hAnsi="Times New Roman" w:cs="Times New Roman"/>
+          <w:i/>
+          <w:iCs/>
+          <w:color w:val="FF0000"/>
+          <w:sz w:val="24"/>
+          <w:szCs w:val="24"/>
+        </w:rPr>
+        <w:t>7</w:t>
+      </w:r>
+      <w:r>
+        <w:rPr>
+          <w:rFonts w:ascii="Times New Roman" w:hAnsi="Times New Roman" w:cs="Times New Roman"/>
+          <w:i/>
+          <w:iCs/>
+          <w:color w:val="FF0000"/>
+          <w:sz w:val="24"/>
+          <w:szCs w:val="24"/>
+        </w:rPr>
+        <w:t>)</w:t>
+      </w:r>
+      <w:r>
+        <w:rPr>
+          <w:rFonts w:ascii="Times New Roman" w:hAnsi="Times New Roman" w:cs="Times New Roman"/>
+          <w:i/>
+          <w:iCs/>
+          <w:color w:val="FF0000"/>
+          <w:sz w:val="24"/>
+          <w:szCs w:val="24"/>
+        </w:rPr>
+        <w:t xml:space="preserve">: </w:t>
+      </w:r>
+      <w:r>
+        <w:rPr>
+          <w:rFonts w:ascii="Times New Roman" w:hAnsi="Times New Roman" w:cs="Times New Roman"/>
+          <w:b/>
+          <w:bCs/>
+          <w:sz w:val="24"/>
+          <w:szCs w:val="24"/>
+        </w:rPr>
+        <w:t>Возлюблю</w:t>
+      </w:r>
+      <w:r>
+        <w:rPr>
+          <w:rFonts w:ascii="Times New Roman" w:eastAsia="Gentium Plus" w:hAnsi="Times New Roman" w:cs="Times New Roman"/>
+          <w:b/>
+          <w:bCs/>
+          <w:color w:val="000000"/>
+          <w:sz w:val="24"/>
+          <w:szCs w:val="24"/>
+        </w:rPr>
+        <w:t>́</w:t>
+      </w:r>
+      <w:r>
+        <w:rPr>
+          <w:rFonts w:ascii="Times New Roman" w:hAnsi="Times New Roman" w:cs="Times New Roman"/>
+          <w:b/>
+          <w:bCs/>
+          <w:sz w:val="24"/>
+          <w:szCs w:val="24"/>
+        </w:rPr>
+        <w:t xml:space="preserve"> Тебе</w:t>
+      </w:r>
+      <w:r>
+        <w:rPr>
+          <w:rFonts w:ascii="Times New Roman" w:eastAsia="Gentium Plus" w:hAnsi="Times New Roman" w:cs="Times New Roman"/>
+          <w:b/>
+          <w:bCs/>
+          <w:color w:val="000000"/>
+          <w:sz w:val="24"/>
+          <w:szCs w:val="24"/>
+        </w:rPr>
+        <w:t>́</w:t>
+      </w:r>
+      <w:r>
+        <w:rPr>
+          <w:rFonts w:ascii="Times New Roman" w:hAnsi="Times New Roman" w:cs="Times New Roman"/>
+          <w:b/>
+          <w:bCs/>
+          <w:sz w:val="24"/>
+          <w:szCs w:val="24"/>
+        </w:rPr>
+        <w:t>, Го</w:t>
+      </w:r>
+      <w:r>
+        <w:rPr>
+          <w:rFonts w:ascii="Times New Roman" w:eastAsia="Gentium Plus" w:hAnsi="Times New Roman" w:cs="Times New Roman"/>
+          <w:b/>
+          <w:bCs/>
+          <w:color w:val="000000"/>
+          <w:sz w:val="24"/>
+          <w:szCs w:val="24"/>
+        </w:rPr>
+        <w:t>́</w:t>
+      </w:r>
+      <w:r>
+        <w:rPr>
+          <w:rFonts w:ascii="Times New Roman" w:hAnsi="Times New Roman" w:cs="Times New Roman"/>
+          <w:b/>
+          <w:bCs/>
+          <w:sz w:val="24"/>
+          <w:szCs w:val="24"/>
+        </w:rPr>
+        <w:t>споди, крі́посте моя</w:t>
+      </w:r>
+      <w:r>
+        <w:rPr>
+          <w:rFonts w:ascii="Times New Roman" w:eastAsia="Gentium Plus" w:hAnsi="Times New Roman" w:cs="Times New Roman"/>
+          <w:b/>
+          <w:bCs/>
+          <w:color w:val="000000"/>
+          <w:sz w:val="24"/>
+          <w:szCs w:val="24"/>
+        </w:rPr>
+        <w:t>́</w:t>
+      </w:r>
+      <w:r>
+        <w:rPr>
+          <w:rFonts w:ascii="Times New Roman" w:hAnsi="Times New Roman" w:cs="Times New Roman"/>
+          <w:b/>
+          <w:bCs/>
+          <w:sz w:val="24"/>
+          <w:szCs w:val="24"/>
+        </w:rPr>
+        <w:t>,* Госпо</w:t>
+      </w:r>
+      <w:r>
+        <w:rPr>
+          <w:rFonts w:ascii="Times New Roman" w:eastAsia="Gentium Plus" w:hAnsi="Times New Roman" w:cs="Times New Roman"/>
+          <w:b/>
+          <w:bCs/>
+          <w:color w:val="000000"/>
+          <w:sz w:val="24"/>
+          <w:szCs w:val="24"/>
+        </w:rPr>
+        <w:t>́</w:t>
+      </w:r>
+      <w:r>
+        <w:rPr>
+          <w:rFonts w:ascii="Times New Roman" w:hAnsi="Times New Roman" w:cs="Times New Roman"/>
+          <w:b/>
+          <w:bCs/>
+          <w:sz w:val="24"/>
+          <w:szCs w:val="24"/>
+        </w:rPr>
+        <w:t>дь тверди</w:t>
+      </w:r>
+      <w:r>
+        <w:rPr>
+          <w:rFonts w:ascii="Times New Roman" w:eastAsia="Gentium Plus" w:hAnsi="Times New Roman" w:cs="Times New Roman"/>
+          <w:b/>
+          <w:bCs/>
+          <w:color w:val="000000"/>
+          <w:sz w:val="24"/>
+          <w:szCs w:val="24"/>
+        </w:rPr>
+        <w:t>́</w:t>
+      </w:r>
+      <w:r>
+        <w:rPr>
+          <w:rFonts w:ascii="Times New Roman" w:hAnsi="Times New Roman" w:cs="Times New Roman"/>
+          <w:b/>
+          <w:bCs/>
+          <w:sz w:val="24"/>
+          <w:szCs w:val="24"/>
+        </w:rPr>
+        <w:t>ня моя</w:t>
+      </w:r>
+      <w:r>
+        <w:rPr>
+          <w:rFonts w:ascii="Times New Roman" w:eastAsia="Gentium Plus" w:hAnsi="Times New Roman" w:cs="Times New Roman"/>
+          <w:b/>
+          <w:bCs/>
+          <w:color w:val="000000"/>
+          <w:sz w:val="24"/>
+          <w:szCs w:val="24"/>
+        </w:rPr>
+        <w:t>́</w:t>
+      </w:r>
+      <w:r>
+        <w:rPr>
+          <w:rFonts w:ascii="Times New Roman" w:hAnsi="Times New Roman" w:cs="Times New Roman"/>
+          <w:b/>
+          <w:bCs/>
+          <w:sz w:val="24"/>
+          <w:szCs w:val="24"/>
+        </w:rPr>
+        <w:t>.</w:t>
+      </w:r>
+    </w:p>
+    <w:p>
+      <w:pPr>
+        <w:rPr>
+          <w:rFonts w:ascii="Times New Roman" w:hAnsi="Times New Roman" w:cs="Times New Roman"/>
+          <w:sz w:val="24"/>
+          <w:szCs w:val="24"/>
+        </w:rPr>
+      </w:pPr>
+      <w:r>
+        <w:rPr>
+          <w:rFonts w:ascii="Times New Roman" w:hAnsi="Times New Roman" w:cs="Times New Roman"/>
+          <w:i/>
+          <w:color w:val="FF0000"/>
+          <w:sz w:val="24"/>
+          <w:szCs w:val="24"/>
+        </w:rPr>
+        <w:t xml:space="preserve">Стих: </w:t>
+      </w:r>
+      <w:r>
+        <w:rPr>
+          <w:rFonts w:ascii="Times New Roman" w:hAnsi="Times New Roman" w:cs="Times New Roman"/>
+          <w:sz w:val="24"/>
+          <w:szCs w:val="24"/>
+        </w:rPr>
+        <w:t>Бог мій − помічни</w:t>
+      </w:r>
+      <w:r>
+        <w:rPr>
+          <w:rFonts w:ascii="Times New Roman" w:eastAsia="Gentium Plus" w:hAnsi="Times New Roman" w:cs="Times New Roman"/>
+          <w:color w:val="000000"/>
+          <w:sz w:val="24"/>
+          <w:szCs w:val="24"/>
+        </w:rPr>
+        <w:t>́</w:t>
+      </w:r>
+      <w:r>
+        <w:rPr>
+          <w:rFonts w:ascii="Times New Roman" w:hAnsi="Times New Roman" w:cs="Times New Roman"/>
+          <w:sz w:val="24"/>
+          <w:szCs w:val="24"/>
+        </w:rPr>
+        <w:t>к мій, на Ньо</w:t>
+      </w:r>
+      <w:r>
+        <w:rPr>
+          <w:rFonts w:ascii="Times New Roman" w:eastAsia="Gentium Plus" w:hAnsi="Times New Roman" w:cs="Times New Roman"/>
+          <w:color w:val="000000"/>
+          <w:sz w:val="24"/>
+          <w:szCs w:val="24"/>
+        </w:rPr>
+        <w:t>́</w:t>
+      </w:r>
+      <w:r>
+        <w:rPr>
+          <w:rFonts w:ascii="Times New Roman" w:hAnsi="Times New Roman" w:cs="Times New Roman"/>
+          <w:sz w:val="24"/>
+          <w:szCs w:val="24"/>
+        </w:rPr>
+        <w:t>го впова</w:t>
+      </w:r>
+      <w:r>
+        <w:rPr>
+          <w:rFonts w:ascii="Times New Roman" w:eastAsia="Gentium Plus" w:hAnsi="Times New Roman" w:cs="Times New Roman"/>
+          <w:color w:val="000000"/>
+          <w:sz w:val="24"/>
+          <w:szCs w:val="24"/>
+        </w:rPr>
+        <w:t>́</w:t>
+      </w:r>
+      <w:r>
+        <w:rPr>
+          <w:rFonts w:ascii="Times New Roman" w:hAnsi="Times New Roman" w:cs="Times New Roman"/>
+          <w:sz w:val="24"/>
+          <w:szCs w:val="24"/>
+        </w:rPr>
+        <w:t>ю.</w:t>
+      </w:r>
+    </w:p>
+    <w:p>
+      <w:pPr>
+        <w:rPr>
+          <w:rFonts w:ascii="Times New Roman" w:hAnsi="Times New Roman" w:cs="Times New Roman"/>
+          <w:sz w:val="24"/>
+          <w:szCs w:val="24"/>
+          <w:shd w:val="clear" w:color="auto" w:fill="FFFF00"/>
+        </w:rPr>
+      </w:pPr>
+      <w:r>
+        <w:rPr>
+          <w:rFonts w:ascii="Times New Roman" w:hAnsi="Times New Roman" w:cs="Times New Roman"/>
+          <w:i/>
+          <w:color w:val="FF0000"/>
+          <w:sz w:val="24"/>
+          <w:szCs w:val="24"/>
+        </w:rPr>
+        <w:t xml:space="preserve">Стих: </w:t>
+      </w:r>
+      <w:r>
+        <w:rPr>
+          <w:rFonts w:ascii="Times New Roman" w:hAnsi="Times New Roman" w:cs="Times New Roman"/>
+          <w:sz w:val="24"/>
+          <w:szCs w:val="24"/>
+        </w:rPr>
+        <w:t>Прославля</w:t>
+      </w:r>
+      <w:r>
+        <w:rPr>
+          <w:rFonts w:ascii="Times New Roman" w:eastAsia="Gentium Plus" w:hAnsi="Times New Roman" w:cs="Times New Roman"/>
+          <w:color w:val="000000"/>
+          <w:sz w:val="24"/>
+          <w:szCs w:val="24"/>
+        </w:rPr>
+        <w:t>́</w:t>
+      </w:r>
+      <w:r>
+        <w:rPr>
+          <w:rFonts w:ascii="Times New Roman" w:hAnsi="Times New Roman" w:cs="Times New Roman"/>
+          <w:sz w:val="24"/>
+          <w:szCs w:val="24"/>
+        </w:rPr>
+        <w:t>ючи, призива</w:t>
+      </w:r>
+      <w:r>
+        <w:rPr>
+          <w:rFonts w:ascii="Times New Roman" w:eastAsia="Gentium Plus" w:hAnsi="Times New Roman" w:cs="Times New Roman"/>
+          <w:color w:val="000000"/>
+          <w:sz w:val="24"/>
+          <w:szCs w:val="24"/>
+        </w:rPr>
+        <w:t>́</w:t>
+      </w:r>
+      <w:r>
+        <w:rPr>
+          <w:rFonts w:ascii="Times New Roman" w:hAnsi="Times New Roman" w:cs="Times New Roman"/>
+          <w:sz w:val="24"/>
+          <w:szCs w:val="24"/>
+        </w:rPr>
+        <w:t>тиму Го</w:t>
+      </w:r>
+      <w:r>
+        <w:rPr>
+          <w:rFonts w:ascii="Times New Roman" w:eastAsia="Gentium Plus" w:hAnsi="Times New Roman" w:cs="Times New Roman"/>
+          <w:color w:val="000000"/>
+          <w:sz w:val="24"/>
+          <w:szCs w:val="24"/>
+        </w:rPr>
+        <w:t>́</w:t>
+      </w:r>
+      <w:r>
+        <w:rPr>
+          <w:rFonts w:ascii="Times New Roman" w:hAnsi="Times New Roman" w:cs="Times New Roman"/>
+          <w:sz w:val="24"/>
+          <w:szCs w:val="24"/>
+        </w:rPr>
+        <w:t>спода і від ворогі́в мо</w:t>
+      </w:r>
+      <w:r>
+        <w:rPr>
+          <w:rFonts w:ascii="Times New Roman" w:eastAsia="Gentium Plus" w:hAnsi="Times New Roman" w:cs="Times New Roman"/>
+          <w:color w:val="000000"/>
+          <w:sz w:val="24"/>
+          <w:szCs w:val="24"/>
+        </w:rPr>
+        <w:t>ї́</w:t>
+      </w:r>
+      <w:r>
+        <w:rPr>
+          <w:rFonts w:ascii="Times New Roman" w:hAnsi="Times New Roman" w:cs="Times New Roman"/>
+          <w:sz w:val="24"/>
+          <w:szCs w:val="24"/>
+        </w:rPr>
+        <w:t>х спасу</w:t>
+      </w:r>
+      <w:r>
+        <w:rPr>
+          <w:rFonts w:ascii="Times New Roman" w:eastAsia="Gentium Plus" w:hAnsi="Times New Roman" w:cs="Times New Roman"/>
+          <w:color w:val="000000"/>
+          <w:sz w:val="24"/>
+          <w:szCs w:val="24"/>
+        </w:rPr>
+        <w:t>́</w:t>
+      </w:r>
+      <w:r>
+        <w:rPr>
+          <w:rFonts w:ascii="Times New Roman" w:hAnsi="Times New Roman" w:cs="Times New Roman"/>
+          <w:sz w:val="24"/>
+          <w:szCs w:val="24"/>
+        </w:rPr>
+        <w:t>ся.</w:t>
+      </w:r>
+    </w:p>
+    <w:p>
+      <w:pPr>
+        <w:rPr>
+          <w:rFonts w:ascii="Times New Roman" w:hAnsi="Times New Roman" w:cs="Times New Roman"/>
+          <w:sz w:val="24"/>
+          <w:szCs w:val="24"/>
+        </w:rPr>
+      </w:pPr>
+      <w:r>
+        <w:rPr>
+          <w:rFonts w:ascii="Times New Roman" w:hAnsi="Times New Roman" w:cs="Times New Roman"/>
+          <w:i/>
+          <w:color w:val="FF0000"/>
+          <w:sz w:val="24"/>
+          <w:szCs w:val="24"/>
+        </w:rPr>
+        <w:t xml:space="preserve">Стих: </w:t>
+      </w:r>
+      <w:r>
+        <w:rPr>
+          <w:rFonts w:ascii="Times New Roman" w:hAnsi="Times New Roman" w:cs="Times New Roman"/>
+          <w:sz w:val="24"/>
+          <w:szCs w:val="24"/>
+        </w:rPr>
+        <w:t>Почу</w:t>
+      </w:r>
+      <w:r>
+        <w:rPr>
+          <w:rFonts w:ascii="Times New Roman" w:eastAsia="Gentium Plus" w:hAnsi="Times New Roman" w:cs="Times New Roman"/>
+          <w:color w:val="000000"/>
+          <w:sz w:val="24"/>
+          <w:szCs w:val="24"/>
+        </w:rPr>
+        <w:t>́</w:t>
+      </w:r>
+      <w:r>
+        <w:rPr>
+          <w:rFonts w:ascii="Times New Roman" w:hAnsi="Times New Roman" w:cs="Times New Roman"/>
+          <w:sz w:val="24"/>
+          <w:szCs w:val="24"/>
+        </w:rPr>
+        <w:t>в Він го</w:t>
+      </w:r>
+      <w:r>
+        <w:rPr>
+          <w:rFonts w:ascii="Times New Roman" w:eastAsia="Gentium Plus" w:hAnsi="Times New Roman" w:cs="Times New Roman"/>
+          <w:color w:val="000000"/>
+          <w:sz w:val="24"/>
+          <w:szCs w:val="24"/>
+        </w:rPr>
+        <w:t>́</w:t>
+      </w:r>
+      <w:r>
+        <w:rPr>
+          <w:rFonts w:ascii="Times New Roman" w:hAnsi="Times New Roman" w:cs="Times New Roman"/>
+          <w:sz w:val="24"/>
+          <w:szCs w:val="24"/>
+        </w:rPr>
+        <w:t>лос мій із хра</w:t>
+      </w:r>
+      <w:r>
+        <w:rPr>
+          <w:rFonts w:ascii="Times New Roman" w:eastAsia="Gentium Plus" w:hAnsi="Times New Roman" w:cs="Times New Roman"/>
+          <w:color w:val="000000"/>
+          <w:sz w:val="24"/>
+          <w:szCs w:val="24"/>
+        </w:rPr>
+        <w:t>́</w:t>
+      </w:r>
+      <w:r>
+        <w:rPr>
+          <w:rFonts w:ascii="Times New Roman" w:hAnsi="Times New Roman" w:cs="Times New Roman"/>
+          <w:sz w:val="24"/>
+          <w:szCs w:val="24"/>
+        </w:rPr>
+        <w:t>му свято</w:t>
+      </w:r>
+      <w:r>
+        <w:rPr>
+          <w:rFonts w:ascii="Times New Roman" w:eastAsia="Gentium Plus" w:hAnsi="Times New Roman" w:cs="Times New Roman"/>
+          <w:color w:val="000000"/>
+          <w:sz w:val="24"/>
+          <w:szCs w:val="24"/>
+        </w:rPr>
+        <w:t>́</w:t>
+      </w:r>
+      <w:r>
+        <w:rPr>
+          <w:rFonts w:ascii="Times New Roman" w:hAnsi="Times New Roman" w:cs="Times New Roman"/>
+          <w:sz w:val="24"/>
+          <w:szCs w:val="24"/>
+        </w:rPr>
+        <w:t>го Свого</w:t>
+      </w:r>
+      <w:r>
+        <w:rPr>
+          <w:rFonts w:ascii="Times New Roman" w:eastAsia="Gentium Plus" w:hAnsi="Times New Roman" w:cs="Times New Roman"/>
+          <w:color w:val="000000"/>
+          <w:sz w:val="24"/>
+          <w:szCs w:val="24"/>
+        </w:rPr>
+        <w:t>́</w:t>
+      </w:r>
+      <w:r>
+        <w:rPr>
+          <w:rFonts w:ascii="Times New Roman" w:hAnsi="Times New Roman" w:cs="Times New Roman"/>
+          <w:sz w:val="24"/>
+          <w:szCs w:val="24"/>
+        </w:rPr>
+        <w:t>.</w:t>
+      </w:r>
+    </w:p>
+    <w:p>
+      <w:pPr>
+        <w:pStyle w:val="Heading3"/>
+        <w:spacing w:before="0" w:after="120"/>
+        <w:jc w:val="center"/>
+        <w:rPr>
+          <w:rFonts w:ascii="Times New Roman" w:hAnsi="Times New Roman" w:cs="Times New Roman"/>
+          <w:b/>
+          <w:bCs/>
+          <w:i/>
+          <w:iCs/>
+          <w:color w:val="FF0000"/>
+        </w:rPr>
+      </w:pPr>
+      <w:r>
+        <w:rPr>
+          <w:rFonts w:ascii="Times New Roman" w:hAnsi="Times New Roman" w:cs="Times New Roman"/>
+          <w:b/>
+          <w:bCs/>
+          <w:i/>
+          <w:iCs/>
+          <w:color w:val="FF0000"/>
+        </w:rPr>
+        <w:t>Прокімен</w:t>
+      </w:r>
+    </w:p>
+    <w:p>
+      <w:pPr>
+        <w:jc w:val="center"/>
+        <w:rPr>
+          <w:rFonts w:ascii="Times New Roman" w:hAnsi="Times New Roman" w:cs="Times New Roman"/>
+          <w:i/>
+          <w:iCs/>
+          <w:color w:val="FF0000"/>
+          <w:sz w:val="24"/>
+          <w:szCs w:val="24"/>
+        </w:rPr>
+      </w:pPr>
+      <w:r>
+        <w:rPr>
+          <w:rFonts w:ascii="Times New Roman" w:hAnsi="Times New Roman" w:cs="Times New Roman"/>
+          <w:i/>
+          <w:iCs/>
+          <w:color w:val="FF0000"/>
+          <w:sz w:val="24"/>
+          <w:szCs w:val="24"/>
+        </w:rPr>
+        <w:t>Псалом 60</w:t>
+      </w:r>
+    </w:p>
+    <w:p>
+      <w:pPr>
+        <w:rPr>
+          <w:rFonts w:ascii="Times New Roman" w:hAnsi="Times New Roman" w:cs="Times New Roman"/>
+          <w:b/>
+          <w:bCs/>
+          <w:sz w:val="24"/>
+          <w:szCs w:val="24"/>
+        </w:rPr>
+      </w:pPr>
+      <w:r>
+        <w:rPr>
+          <w:rFonts w:ascii="Times New Roman" w:hAnsi="Times New Roman" w:cs="Times New Roman"/>
+          <w:i/>
+          <w:iCs/>
+          <w:color w:val="FF0000"/>
+          <w:sz w:val="24"/>
+          <w:szCs w:val="24"/>
+        </w:rPr>
+        <w:t>(г. 8)</w:t>
+      </w:r>
+      <w:r>
+        <w:rPr>
+          <w:rFonts w:ascii="Times New Roman" w:hAnsi="Times New Roman" w:cs="Times New Roman"/>
+          <w:i/>
+          <w:iCs/>
+          <w:color w:val="FF0000"/>
+          <w:sz w:val="24"/>
+          <w:szCs w:val="24"/>
+        </w:rPr>
+        <w:t xml:space="preserve">: </w:t>
+      </w:r>
+      <w:r>
+        <w:rPr>
+          <w:rFonts w:ascii="Times New Roman" w:hAnsi="Times New Roman" w:cs="Times New Roman"/>
+          <w:b/>
+          <w:bCs/>
+          <w:sz w:val="24"/>
+          <w:szCs w:val="24"/>
+        </w:rPr>
+        <w:t>Дав єси</w:t>
+      </w:r>
+      <w:r>
+        <w:rPr>
+          <w:rFonts w:ascii="Times New Roman" w:eastAsia="Gentium Plus" w:hAnsi="Times New Roman" w:cs="Times New Roman"/>
+          <w:b/>
+          <w:bCs/>
+          <w:color w:val="000000"/>
+          <w:sz w:val="24"/>
+          <w:szCs w:val="24"/>
+        </w:rPr>
+        <w:t>́</w:t>
+      </w:r>
+      <w:r>
+        <w:rPr>
+          <w:rFonts w:ascii="Times New Roman" w:hAnsi="Times New Roman" w:cs="Times New Roman"/>
+          <w:b/>
+          <w:bCs/>
+          <w:sz w:val="24"/>
+          <w:szCs w:val="24"/>
+        </w:rPr>
+        <w:t xml:space="preserve"> спадкоє</w:t>
+      </w:r>
+      <w:r>
+        <w:rPr>
+          <w:rFonts w:ascii="Times New Roman" w:eastAsia="Gentium Plus" w:hAnsi="Times New Roman" w:cs="Times New Roman"/>
+          <w:b/>
+          <w:bCs/>
+          <w:color w:val="000000"/>
+          <w:sz w:val="24"/>
+          <w:szCs w:val="24"/>
+        </w:rPr>
+        <w:t>́</w:t>
+      </w:r>
+      <w:r>
+        <w:rPr>
+          <w:rFonts w:ascii="Times New Roman" w:hAnsi="Times New Roman" w:cs="Times New Roman"/>
+          <w:b/>
+          <w:bCs/>
+          <w:sz w:val="24"/>
+          <w:szCs w:val="24"/>
+        </w:rPr>
+        <w:t>мство тим, що боя</w:t>
+      </w:r>
+      <w:r>
+        <w:rPr>
+          <w:rFonts w:ascii="Times New Roman" w:eastAsia="Gentium Plus" w:hAnsi="Times New Roman" w:cs="Times New Roman"/>
+          <w:b/>
+          <w:bCs/>
+          <w:color w:val="000000"/>
+          <w:sz w:val="24"/>
+          <w:szCs w:val="24"/>
+        </w:rPr>
+        <w:t>́</w:t>
+      </w:r>
+      <w:r>
+        <w:rPr>
+          <w:rFonts w:ascii="Times New Roman" w:hAnsi="Times New Roman" w:cs="Times New Roman"/>
+          <w:b/>
+          <w:bCs/>
+          <w:sz w:val="24"/>
+          <w:szCs w:val="24"/>
+        </w:rPr>
+        <w:t>ться Тебе</w:t>
+      </w:r>
+      <w:r>
+        <w:rPr>
+          <w:rFonts w:ascii="Times New Roman" w:eastAsia="Gentium Plus" w:hAnsi="Times New Roman" w:cs="Times New Roman"/>
+          <w:b/>
+          <w:bCs/>
+          <w:color w:val="000000"/>
+          <w:sz w:val="24"/>
+          <w:szCs w:val="24"/>
+        </w:rPr>
+        <w:t>́</w:t>
+      </w:r>
+      <w:r>
+        <w:rPr>
+          <w:rFonts w:ascii="Times New Roman" w:hAnsi="Times New Roman" w:cs="Times New Roman"/>
+          <w:b/>
+          <w:bCs/>
+          <w:sz w:val="24"/>
+          <w:szCs w:val="24"/>
+        </w:rPr>
+        <w:t>, Го</w:t>
+      </w:r>
+      <w:r>
+        <w:rPr>
+          <w:rFonts w:ascii="Times New Roman" w:eastAsia="Gentium Plus" w:hAnsi="Times New Roman" w:cs="Times New Roman"/>
+          <w:b/>
+          <w:bCs/>
+          <w:color w:val="000000"/>
+          <w:sz w:val="24"/>
+          <w:szCs w:val="24"/>
+        </w:rPr>
+        <w:t>́</w:t>
+      </w:r>
+      <w:r>
+        <w:rPr>
+          <w:rFonts w:ascii="Times New Roman" w:hAnsi="Times New Roman" w:cs="Times New Roman"/>
+          <w:b/>
+          <w:bCs/>
+          <w:sz w:val="24"/>
+          <w:szCs w:val="24"/>
+        </w:rPr>
+        <w:t>споди.</w:t>
+      </w:r>
+    </w:p>
+    <w:p>
+      <w:pPr>
+        <w:rPr>
+          <w:rFonts w:ascii="Times New Roman" w:hAnsi="Times New Roman" w:cs="Times New Roman"/>
+          <w:sz w:val="24"/>
+          <w:szCs w:val="24"/>
+        </w:rPr>
+      </w:pPr>
+      <w:r>
+        <w:rPr>
+          <w:rFonts w:ascii="Times New Roman" w:hAnsi="Times New Roman" w:cs="Times New Roman"/>
+          <w:i/>
+          <w:color w:val="FF0000"/>
+          <w:sz w:val="24"/>
+          <w:szCs w:val="24"/>
+        </w:rPr>
+        <w:t xml:space="preserve">Стих: </w:t>
+      </w:r>
+      <w:r>
+        <w:rPr>
+          <w:rFonts w:ascii="Times New Roman" w:hAnsi="Times New Roman" w:cs="Times New Roman"/>
+          <w:sz w:val="24"/>
+          <w:szCs w:val="24"/>
+        </w:rPr>
+        <w:t>Від кінці́в землі́ до Те</w:t>
+      </w:r>
+      <w:r>
+        <w:rPr>
+          <w:rFonts w:ascii="Times New Roman" w:eastAsia="Gentium Plus" w:hAnsi="Times New Roman" w:cs="Times New Roman"/>
+          <w:color w:val="000000"/>
+          <w:sz w:val="24"/>
+          <w:szCs w:val="24"/>
+        </w:rPr>
+        <w:t>́</w:t>
+      </w:r>
+      <w:r>
+        <w:rPr>
+          <w:rFonts w:ascii="Times New Roman" w:hAnsi="Times New Roman" w:cs="Times New Roman"/>
+          <w:sz w:val="24"/>
+          <w:szCs w:val="24"/>
+        </w:rPr>
+        <w:t>бе кли</w:t>
+      </w:r>
+      <w:r>
+        <w:rPr>
+          <w:rFonts w:ascii="Times New Roman" w:eastAsia="Gentium Plus" w:hAnsi="Times New Roman" w:cs="Times New Roman"/>
+          <w:color w:val="000000"/>
+          <w:sz w:val="24"/>
+          <w:szCs w:val="24"/>
+        </w:rPr>
+        <w:t>́</w:t>
+      </w:r>
+      <w:r>
+        <w:rPr>
+          <w:rFonts w:ascii="Times New Roman" w:hAnsi="Times New Roman" w:cs="Times New Roman"/>
+          <w:sz w:val="24"/>
+          <w:szCs w:val="24"/>
+        </w:rPr>
+        <w:t>чу.</w:t>
+      </w:r>
+    </w:p>
+    <w:p>
+      <w:pPr>
+        <w:rPr>
+          <w:rFonts w:ascii="Times New Roman" w:hAnsi="Times New Roman" w:cs="Times New Roman"/>
+          <w:sz w:val="24"/>
+          <w:szCs w:val="24"/>
+          <w:shd w:val="clear" w:color="auto" w:fill="FFFF00"/>
+        </w:rPr>
+      </w:pPr>
+      <w:r>
+        <w:rPr>
+          <w:rFonts w:ascii="Times New Roman" w:hAnsi="Times New Roman" w:cs="Times New Roman"/>
+          <w:i/>
+          <w:color w:val="FF0000"/>
+          <w:sz w:val="24"/>
+          <w:szCs w:val="24"/>
+        </w:rPr>
+        <w:t xml:space="preserve">Стих: </w:t>
+      </w:r>
+      <w:r>
+        <w:rPr>
+          <w:rFonts w:ascii="Times New Roman" w:hAnsi="Times New Roman" w:cs="Times New Roman"/>
+          <w:sz w:val="24"/>
+          <w:szCs w:val="24"/>
+        </w:rPr>
+        <w:t>Покри</w:t>
+      </w:r>
+      <w:r>
+        <w:rPr>
+          <w:rFonts w:ascii="Times New Roman" w:eastAsia="Gentium Plus" w:hAnsi="Times New Roman" w:cs="Times New Roman"/>
+          <w:color w:val="000000"/>
+          <w:sz w:val="24"/>
+          <w:szCs w:val="24"/>
+        </w:rPr>
+        <w:t>́</w:t>
+      </w:r>
+      <w:r>
+        <w:rPr>
+          <w:rFonts w:ascii="Times New Roman" w:hAnsi="Times New Roman" w:cs="Times New Roman"/>
+          <w:sz w:val="24"/>
+          <w:szCs w:val="24"/>
+        </w:rPr>
+        <w:t>юся покро</w:t>
+      </w:r>
+      <w:r>
+        <w:rPr>
+          <w:rFonts w:ascii="Times New Roman" w:eastAsia="Gentium Plus" w:hAnsi="Times New Roman" w:cs="Times New Roman"/>
+          <w:color w:val="000000"/>
+          <w:sz w:val="24"/>
+          <w:szCs w:val="24"/>
+        </w:rPr>
+        <w:t>́</w:t>
+      </w:r>
+      <w:r>
+        <w:rPr>
+          <w:rFonts w:ascii="Times New Roman" w:hAnsi="Times New Roman" w:cs="Times New Roman"/>
+          <w:sz w:val="24"/>
+          <w:szCs w:val="24"/>
+        </w:rPr>
+        <w:t>вом крил Тво</w:t>
+      </w:r>
+      <w:r>
+        <w:rPr>
+          <w:rFonts w:ascii="Times New Roman" w:eastAsia="Gentium Plus" w:hAnsi="Times New Roman" w:cs="Times New Roman"/>
+          <w:color w:val="000000"/>
+          <w:sz w:val="24"/>
+          <w:szCs w:val="24"/>
+        </w:rPr>
+        <w:t>ї́</w:t>
+      </w:r>
+      <w:r>
+        <w:rPr>
+          <w:rFonts w:ascii="Times New Roman" w:hAnsi="Times New Roman" w:cs="Times New Roman"/>
+          <w:sz w:val="24"/>
+          <w:szCs w:val="24"/>
+        </w:rPr>
+        <w:t>х.</w:t>
+      </w:r>
+    </w:p>
+    <w:p>
+      <w:pPr>
+        <w:rPr>
+          <w:rFonts w:ascii="Times New Roman" w:hAnsi="Times New Roman" w:cs="Times New Roman"/>
+          <w:sz w:val="24"/>
+          <w:szCs w:val="24"/>
+        </w:rPr>
+      </w:pPr>
+      <w:r>
+        <w:rPr>
+          <w:rFonts w:ascii="Times New Roman" w:hAnsi="Times New Roman" w:cs="Times New Roman"/>
+          <w:i/>
+          <w:color w:val="FF0000"/>
+          <w:sz w:val="24"/>
+          <w:szCs w:val="24"/>
+        </w:rPr>
+        <w:t xml:space="preserve">Стих: </w:t>
+      </w:r>
+      <w:r>
+        <w:rPr>
+          <w:rFonts w:ascii="Times New Roman" w:hAnsi="Times New Roman" w:cs="Times New Roman"/>
+          <w:sz w:val="24"/>
+          <w:szCs w:val="24"/>
+        </w:rPr>
+        <w:t>Так бу</w:t>
+      </w:r>
+      <w:r>
+        <w:rPr>
+          <w:rFonts w:ascii="Times New Roman" w:eastAsia="Gentium Plus" w:hAnsi="Times New Roman" w:cs="Times New Roman"/>
+          <w:color w:val="000000"/>
+          <w:sz w:val="24"/>
+          <w:szCs w:val="24"/>
+        </w:rPr>
+        <w:t>́</w:t>
+      </w:r>
+      <w:r>
+        <w:rPr>
+          <w:rFonts w:ascii="Times New Roman" w:hAnsi="Times New Roman" w:cs="Times New Roman"/>
+          <w:sz w:val="24"/>
+          <w:szCs w:val="24"/>
+        </w:rPr>
+        <w:t>ду співа</w:t>
+      </w:r>
+      <w:r>
+        <w:rPr>
+          <w:rFonts w:ascii="Times New Roman" w:eastAsia="Gentium Plus" w:hAnsi="Times New Roman" w:cs="Times New Roman"/>
+          <w:color w:val="000000"/>
+          <w:sz w:val="24"/>
+          <w:szCs w:val="24"/>
+        </w:rPr>
+        <w:t>́</w:t>
+      </w:r>
+      <w:r>
+        <w:rPr>
+          <w:rFonts w:ascii="Times New Roman" w:hAnsi="Times New Roman" w:cs="Times New Roman"/>
+          <w:sz w:val="24"/>
+          <w:szCs w:val="24"/>
+        </w:rPr>
+        <w:t>ти і́мені Твоє</w:t>
+      </w:r>
+      <w:r>
+        <w:rPr>
+          <w:rFonts w:ascii="Times New Roman" w:eastAsia="Gentium Plus" w:hAnsi="Times New Roman" w:cs="Times New Roman"/>
+          <w:color w:val="000000"/>
+          <w:sz w:val="24"/>
+          <w:szCs w:val="24"/>
+        </w:rPr>
+        <w:t>́</w:t>
+      </w:r>
+      <w:r>
+        <w:rPr>
+          <w:rFonts w:ascii="Times New Roman" w:hAnsi="Times New Roman" w:cs="Times New Roman"/>
+          <w:sz w:val="24"/>
+          <w:szCs w:val="24"/>
+        </w:rPr>
+        <w:t>му пові́ки.</w:t>
+      </w:r>
+    </w:p>
+    <w:p>
+      <w:pPr>
+        <w:pStyle w:val="Heading3"/>
+        <w:spacing w:before="0" w:after="120"/>
+        <w:jc w:val="center"/>
+        <w:rPr>
+          <w:rFonts w:ascii="Times New Roman" w:hAnsi="Times New Roman" w:cs="Times New Roman"/>
+          <w:b/>
+          <w:bCs/>
+          <w:i/>
+          <w:iCs/>
+          <w:color w:val="FF0000"/>
+        </w:rPr>
+      </w:pPr>
+      <w:r>
+        <w:rPr>
+          <w:rFonts w:ascii="Times New Roman" w:hAnsi="Times New Roman" w:cs="Times New Roman"/>
+          <w:b/>
+          <w:bCs/>
+          <w:i/>
+          <w:iCs/>
+          <w:color w:val="FF0000"/>
+        </w:rPr>
+        <w:lastRenderedPageBreak/>
+        <w:t>Прокімен</w:t>
+      </w:r>
+    </w:p>
+    <w:p>
+      <w:pPr>
+        <w:jc w:val="center"/>
+        <w:rPr>
+          <w:rFonts w:ascii="Times New Roman" w:hAnsi="Times New Roman" w:cs="Times New Roman"/>
+          <w:i/>
+          <w:iCs/>
+          <w:color w:val="FF0000"/>
+          <w:sz w:val="24"/>
+          <w:szCs w:val="24"/>
+        </w:rPr>
+      </w:pPr>
+      <w:r>
+        <w:rPr>
+          <w:rFonts w:ascii="Times New Roman" w:hAnsi="Times New Roman" w:cs="Times New Roman"/>
+          <w:i/>
+          <w:iCs/>
+          <w:color w:val="FF0000"/>
+          <w:sz w:val="24"/>
+          <w:szCs w:val="24"/>
+        </w:rPr>
+        <w:t>Псалом 68</w:t>
+      </w:r>
+    </w:p>
+    <w:p>
+      <w:pPr>
+        <w:rPr>
+          <w:rFonts w:ascii="Times New Roman" w:hAnsi="Times New Roman" w:cs="Times New Roman"/>
+          <w:b/>
+          <w:bCs/>
+          <w:sz w:val="24"/>
+          <w:szCs w:val="24"/>
+          <w:shd w:val="clear" w:color="auto" w:fill="FFFF00"/>
+        </w:rPr>
+      </w:pPr>
+      <w:r>
+        <w:rPr>
+          <w:rFonts w:ascii="Times New Roman" w:hAnsi="Times New Roman" w:cs="Times New Roman"/>
+          <w:i/>
+          <w:iCs/>
+          <w:color w:val="FF0000"/>
+          <w:sz w:val="24"/>
+          <w:szCs w:val="24"/>
+        </w:rPr>
+        <w:t>(г. 8)</w:t>
+      </w:r>
+      <w:r>
+        <w:rPr>
+          <w:rFonts w:ascii="Times New Roman" w:hAnsi="Times New Roman" w:cs="Times New Roman"/>
+          <w:i/>
+          <w:iCs/>
+          <w:color w:val="FF0000"/>
+          <w:sz w:val="24"/>
+          <w:szCs w:val="24"/>
+        </w:rPr>
+        <w:t xml:space="preserve">: </w:t>
+      </w:r>
+      <w:r>
+        <w:rPr>
+          <w:rFonts w:ascii="Times New Roman" w:hAnsi="Times New Roman" w:cs="Times New Roman"/>
+          <w:b/>
+          <w:bCs/>
+          <w:sz w:val="24"/>
+          <w:szCs w:val="24"/>
+        </w:rPr>
+        <w:t>Не відверни</w:t>
+      </w:r>
+      <w:r>
+        <w:rPr>
+          <w:rFonts w:ascii="Times New Roman" w:eastAsia="Gentium Plus" w:hAnsi="Times New Roman" w:cs="Times New Roman"/>
+          <w:b/>
+          <w:bCs/>
+          <w:color w:val="000000"/>
+          <w:sz w:val="24"/>
+          <w:szCs w:val="24"/>
+        </w:rPr>
+        <w:t>́</w:t>
+      </w:r>
+      <w:r>
+        <w:rPr>
+          <w:rFonts w:ascii="Times New Roman" w:hAnsi="Times New Roman" w:cs="Times New Roman"/>
+          <w:b/>
+          <w:bCs/>
+          <w:sz w:val="24"/>
+          <w:szCs w:val="24"/>
+        </w:rPr>
+        <w:t xml:space="preserve"> лиця</w:t>
+      </w:r>
+      <w:r>
+        <w:rPr>
+          <w:rFonts w:ascii="Times New Roman" w:eastAsia="Gentium Plus" w:hAnsi="Times New Roman" w:cs="Times New Roman"/>
+          <w:b/>
+          <w:bCs/>
+          <w:color w:val="000000"/>
+          <w:sz w:val="24"/>
+          <w:szCs w:val="24"/>
+        </w:rPr>
+        <w:t>́</w:t>
+      </w:r>
+      <w:r>
+        <w:rPr>
+          <w:rFonts w:ascii="Times New Roman" w:hAnsi="Times New Roman" w:cs="Times New Roman"/>
+          <w:b/>
+          <w:bCs/>
+          <w:sz w:val="24"/>
+          <w:szCs w:val="24"/>
+        </w:rPr>
+        <w:t xml:space="preserve"> Твого</w:t>
+      </w:r>
+      <w:r>
+        <w:rPr>
+          <w:rFonts w:ascii="Times New Roman" w:eastAsia="Gentium Plus" w:hAnsi="Times New Roman" w:cs="Times New Roman"/>
+          <w:b/>
+          <w:bCs/>
+          <w:color w:val="000000"/>
+          <w:sz w:val="24"/>
+          <w:szCs w:val="24"/>
+        </w:rPr>
+        <w:t>́</w:t>
+      </w:r>
+      <w:r>
+        <w:rPr>
+          <w:rFonts w:ascii="Times New Roman" w:hAnsi="Times New Roman" w:cs="Times New Roman"/>
+          <w:b/>
+          <w:bCs/>
+          <w:sz w:val="24"/>
+          <w:szCs w:val="24"/>
+        </w:rPr>
+        <w:t xml:space="preserve"> від слуги</w:t>
+      </w:r>
+      <w:r>
+        <w:rPr>
+          <w:rFonts w:ascii="Times New Roman" w:eastAsia="Gentium Plus" w:hAnsi="Times New Roman" w:cs="Times New Roman"/>
+          <w:b/>
+          <w:bCs/>
+          <w:color w:val="000000"/>
+          <w:sz w:val="24"/>
+          <w:szCs w:val="24"/>
+        </w:rPr>
+        <w:t>́</w:t>
+      </w:r>
+      <w:r>
+        <w:rPr>
+          <w:rFonts w:ascii="Times New Roman" w:hAnsi="Times New Roman" w:cs="Times New Roman"/>
+          <w:b/>
+          <w:bCs/>
+          <w:sz w:val="24"/>
+          <w:szCs w:val="24"/>
+        </w:rPr>
+        <w:t xml:space="preserve"> Свого</w:t>
+      </w:r>
+      <w:r>
+        <w:rPr>
+          <w:rFonts w:ascii="Times New Roman" w:eastAsia="Gentium Plus" w:hAnsi="Times New Roman" w:cs="Times New Roman"/>
+          <w:b/>
+          <w:bCs/>
+          <w:color w:val="000000"/>
+          <w:sz w:val="24"/>
+          <w:szCs w:val="24"/>
+        </w:rPr>
+        <w:t>́</w:t>
+      </w:r>
+      <w:r>
+        <w:rPr>
+          <w:rFonts w:ascii="Times New Roman" w:hAnsi="Times New Roman" w:cs="Times New Roman"/>
+          <w:b/>
+          <w:bCs/>
+          <w:sz w:val="24"/>
+          <w:szCs w:val="24"/>
+        </w:rPr>
+        <w:t>, бо терплю</w:t>
+      </w:r>
+      <w:r>
+        <w:rPr>
+          <w:rFonts w:ascii="Times New Roman" w:eastAsia="Gentium Plus" w:hAnsi="Times New Roman" w:cs="Times New Roman"/>
+          <w:b/>
+          <w:bCs/>
+          <w:color w:val="000000"/>
+          <w:sz w:val="24"/>
+          <w:szCs w:val="24"/>
+        </w:rPr>
+        <w:t>́</w:t>
+      </w:r>
+      <w:r>
+        <w:rPr>
+          <w:rFonts w:ascii="Times New Roman" w:hAnsi="Times New Roman" w:cs="Times New Roman"/>
+          <w:b/>
+          <w:bCs/>
+          <w:sz w:val="24"/>
+          <w:szCs w:val="24"/>
+        </w:rPr>
+        <w:t xml:space="preserve"> я; нега</w:t>
+      </w:r>
+      <w:r>
+        <w:rPr>
+          <w:rFonts w:ascii="Times New Roman" w:eastAsia="Gentium Plus" w:hAnsi="Times New Roman" w:cs="Times New Roman"/>
+          <w:b/>
+          <w:bCs/>
+          <w:color w:val="000000"/>
+          <w:sz w:val="24"/>
+          <w:szCs w:val="24"/>
+        </w:rPr>
+        <w:t>́</w:t>
+      </w:r>
+      <w:r>
+        <w:rPr>
+          <w:rFonts w:ascii="Times New Roman" w:hAnsi="Times New Roman" w:cs="Times New Roman"/>
+          <w:b/>
+          <w:bCs/>
+          <w:sz w:val="24"/>
+          <w:szCs w:val="24"/>
+        </w:rPr>
+        <w:t>йно ви</w:t>
+      </w:r>
+      <w:r>
+        <w:rPr>
+          <w:rFonts w:ascii="Times New Roman" w:eastAsia="Gentium Plus" w:hAnsi="Times New Roman" w:cs="Times New Roman"/>
+          <w:b/>
+          <w:bCs/>
+          <w:color w:val="000000"/>
+          <w:sz w:val="24"/>
+          <w:szCs w:val="24"/>
+        </w:rPr>
+        <w:t>́</w:t>
+      </w:r>
+      <w:r>
+        <w:rPr>
+          <w:rFonts w:ascii="Times New Roman" w:hAnsi="Times New Roman" w:cs="Times New Roman"/>
+          <w:b/>
+          <w:bCs/>
+          <w:sz w:val="24"/>
+          <w:szCs w:val="24"/>
+        </w:rPr>
+        <w:t>слухай мене</w:t>
+      </w:r>
+      <w:r>
+        <w:rPr>
+          <w:rFonts w:ascii="Times New Roman" w:eastAsia="Gentium Plus" w:hAnsi="Times New Roman" w:cs="Times New Roman"/>
+          <w:b/>
+          <w:bCs/>
+          <w:color w:val="000000"/>
+          <w:sz w:val="24"/>
+          <w:szCs w:val="24"/>
+        </w:rPr>
+        <w:t>́</w:t>
+      </w:r>
+      <w:r>
+        <w:rPr>
+          <w:rFonts w:ascii="Times New Roman" w:hAnsi="Times New Roman" w:cs="Times New Roman"/>
+          <w:b/>
+          <w:bCs/>
+          <w:sz w:val="24"/>
+          <w:szCs w:val="24"/>
+        </w:rPr>
+        <w:t>. Спогля</w:t>
+      </w:r>
+      <w:r>
+        <w:rPr>
+          <w:rFonts w:ascii="Times New Roman" w:eastAsia="Gentium Plus" w:hAnsi="Times New Roman" w:cs="Times New Roman"/>
+          <w:b/>
+          <w:bCs/>
+          <w:color w:val="000000"/>
+          <w:sz w:val="24"/>
+          <w:szCs w:val="24"/>
+        </w:rPr>
+        <w:t>́</w:t>
+      </w:r>
+      <w:r>
+        <w:rPr>
+          <w:rFonts w:ascii="Times New Roman" w:hAnsi="Times New Roman" w:cs="Times New Roman"/>
+          <w:b/>
+          <w:bCs/>
+          <w:sz w:val="24"/>
+          <w:szCs w:val="24"/>
+        </w:rPr>
+        <w:t>нь на ду</w:t>
+      </w:r>
+      <w:r>
+        <w:rPr>
+          <w:rFonts w:ascii="Times New Roman" w:eastAsia="Gentium Plus" w:hAnsi="Times New Roman" w:cs="Times New Roman"/>
+          <w:b/>
+          <w:bCs/>
+          <w:color w:val="000000"/>
+          <w:sz w:val="24"/>
+          <w:szCs w:val="24"/>
+        </w:rPr>
+        <w:t>́</w:t>
+      </w:r>
+      <w:r>
+        <w:rPr>
+          <w:rFonts w:ascii="Times New Roman" w:hAnsi="Times New Roman" w:cs="Times New Roman"/>
+          <w:b/>
+          <w:bCs/>
+          <w:sz w:val="24"/>
+          <w:szCs w:val="24"/>
+        </w:rPr>
+        <w:t>шу мою</w:t>
+      </w:r>
+      <w:r>
+        <w:rPr>
+          <w:rFonts w:ascii="Times New Roman" w:eastAsia="Gentium Plus" w:hAnsi="Times New Roman" w:cs="Times New Roman"/>
+          <w:b/>
+          <w:bCs/>
+          <w:color w:val="000000"/>
+          <w:sz w:val="24"/>
+          <w:szCs w:val="24"/>
+        </w:rPr>
+        <w:t>́</w:t>
+      </w:r>
+      <w:r>
+        <w:rPr>
+          <w:rFonts w:ascii="Times New Roman" w:hAnsi="Times New Roman" w:cs="Times New Roman"/>
+          <w:b/>
+          <w:bCs/>
+          <w:sz w:val="24"/>
+          <w:szCs w:val="24"/>
+        </w:rPr>
+        <w:t>, і вряту</w:t>
+      </w:r>
+      <w:r>
+        <w:rPr>
+          <w:rFonts w:ascii="Times New Roman" w:eastAsia="Gentium Plus" w:hAnsi="Times New Roman" w:cs="Times New Roman"/>
+          <w:b/>
+          <w:bCs/>
+          <w:color w:val="000000"/>
+          <w:sz w:val="24"/>
+          <w:szCs w:val="24"/>
+        </w:rPr>
+        <w:t>́</w:t>
+      </w:r>
+      <w:r>
+        <w:rPr>
+          <w:rFonts w:ascii="Times New Roman" w:hAnsi="Times New Roman" w:cs="Times New Roman"/>
+          <w:b/>
+          <w:bCs/>
+          <w:sz w:val="24"/>
+          <w:szCs w:val="24"/>
+        </w:rPr>
+        <w:t>й ї</w:t>
+      </w:r>
+      <w:r>
+        <w:rPr>
+          <w:rFonts w:ascii="Times New Roman" w:eastAsia="Gentium Plus" w:hAnsi="Times New Roman" w:cs="Times New Roman"/>
+          <w:b/>
+          <w:bCs/>
+          <w:color w:val="000000"/>
+          <w:sz w:val="24"/>
+          <w:szCs w:val="24"/>
+        </w:rPr>
+        <w:t>ї́</w:t>
+      </w:r>
+      <w:r>
+        <w:rPr>
+          <w:rFonts w:ascii="Times New Roman" w:hAnsi="Times New Roman" w:cs="Times New Roman"/>
+          <w:b/>
+          <w:bCs/>
+          <w:sz w:val="24"/>
+          <w:szCs w:val="24"/>
+        </w:rPr>
+        <w:t>.</w:t>
+      </w:r>
+    </w:p>
+    <w:p>
+      <w:pPr>
+        <w:rPr>
+          <w:rFonts w:ascii="Times New Roman" w:hAnsi="Times New Roman" w:cs="Times New Roman"/>
+          <w:sz w:val="24"/>
+          <w:szCs w:val="24"/>
+        </w:rPr>
+      </w:pPr>
+      <w:r>
+        <w:rPr>
+          <w:rFonts w:ascii="Times New Roman" w:hAnsi="Times New Roman" w:cs="Times New Roman"/>
+          <w:i/>
+          <w:color w:val="FF0000"/>
+          <w:sz w:val="24"/>
+          <w:szCs w:val="24"/>
+        </w:rPr>
+        <w:t xml:space="preserve">Стих: </w:t>
+      </w:r>
+      <w:r>
+        <w:rPr>
+          <w:rFonts w:ascii="Times New Roman" w:hAnsi="Times New Roman" w:cs="Times New Roman"/>
+          <w:sz w:val="24"/>
+          <w:szCs w:val="24"/>
+        </w:rPr>
+        <w:t>Спасі́ння Твоє</w:t>
+      </w:r>
+      <w:r>
+        <w:rPr>
+          <w:rFonts w:ascii="Times New Roman" w:eastAsia="Gentium Plus" w:hAnsi="Times New Roman" w:cs="Times New Roman"/>
+          <w:color w:val="000000"/>
+          <w:sz w:val="24"/>
+          <w:szCs w:val="24"/>
+        </w:rPr>
+        <w:t>́</w:t>
+      </w:r>
+      <w:r>
+        <w:rPr>
+          <w:rFonts w:ascii="Times New Roman" w:hAnsi="Times New Roman" w:cs="Times New Roman"/>
+          <w:sz w:val="24"/>
+          <w:szCs w:val="24"/>
+        </w:rPr>
+        <w:t>, Бо</w:t>
+      </w:r>
+      <w:r>
+        <w:rPr>
+          <w:rFonts w:ascii="Times New Roman" w:eastAsia="Gentium Plus" w:hAnsi="Times New Roman" w:cs="Times New Roman"/>
+          <w:color w:val="000000"/>
+          <w:sz w:val="24"/>
+          <w:szCs w:val="24"/>
+        </w:rPr>
+        <w:t>́</w:t>
+      </w:r>
+      <w:r>
+        <w:rPr>
+          <w:rFonts w:ascii="Times New Roman" w:hAnsi="Times New Roman" w:cs="Times New Roman"/>
+          <w:sz w:val="24"/>
+          <w:szCs w:val="24"/>
+        </w:rPr>
+        <w:t>же, неха</w:t>
+      </w:r>
+      <w:r>
+        <w:rPr>
+          <w:rFonts w:ascii="Times New Roman" w:eastAsia="Gentium Plus" w:hAnsi="Times New Roman" w:cs="Times New Roman"/>
+          <w:color w:val="000000"/>
+          <w:sz w:val="24"/>
+          <w:szCs w:val="24"/>
+        </w:rPr>
+        <w:t>́</w:t>
+      </w:r>
+      <w:r>
+        <w:rPr>
+          <w:rFonts w:ascii="Times New Roman" w:hAnsi="Times New Roman" w:cs="Times New Roman"/>
+          <w:sz w:val="24"/>
+          <w:szCs w:val="24"/>
+        </w:rPr>
+        <w:t>й ого</w:t>
+      </w:r>
+      <w:r>
+        <w:rPr>
+          <w:rFonts w:ascii="Times New Roman" w:eastAsia="Gentium Plus" w:hAnsi="Times New Roman" w:cs="Times New Roman"/>
+          <w:color w:val="000000"/>
+          <w:sz w:val="24"/>
+          <w:szCs w:val="24"/>
+        </w:rPr>
+        <w:t>́</w:t>
+      </w:r>
+      <w:r>
+        <w:rPr>
+          <w:rFonts w:ascii="Times New Roman" w:hAnsi="Times New Roman" w:cs="Times New Roman"/>
+          <w:sz w:val="24"/>
+          <w:szCs w:val="24"/>
+        </w:rPr>
+        <w:t>рне мене</w:t>
+      </w:r>
+      <w:r>
+        <w:rPr>
+          <w:rFonts w:ascii="Times New Roman" w:eastAsia="Gentium Plus" w:hAnsi="Times New Roman" w:cs="Times New Roman"/>
+          <w:color w:val="000000"/>
+          <w:sz w:val="24"/>
+          <w:szCs w:val="24"/>
+        </w:rPr>
+        <w:t>́</w:t>
+      </w:r>
+      <w:r>
+        <w:rPr>
+          <w:rFonts w:ascii="Times New Roman" w:hAnsi="Times New Roman" w:cs="Times New Roman"/>
+          <w:sz w:val="24"/>
+          <w:szCs w:val="24"/>
+        </w:rPr>
+        <w:t>.</w:t>
+      </w:r>
+    </w:p>
+    <w:p>
+      <w:pPr>
+        <w:rPr>
+          <w:rFonts w:ascii="Times New Roman" w:hAnsi="Times New Roman" w:cs="Times New Roman"/>
+          <w:sz w:val="24"/>
+          <w:szCs w:val="24"/>
+        </w:rPr>
+      </w:pPr>
+      <w:r>
+        <w:rPr>
+          <w:rFonts w:ascii="Times New Roman" w:hAnsi="Times New Roman" w:cs="Times New Roman"/>
+          <w:i/>
+          <w:color w:val="FF0000"/>
+          <w:sz w:val="24"/>
+          <w:szCs w:val="24"/>
+        </w:rPr>
+        <w:t xml:space="preserve">Стих: </w:t>
+      </w:r>
+      <w:r>
+        <w:rPr>
+          <w:rFonts w:ascii="Times New Roman" w:hAnsi="Times New Roman" w:cs="Times New Roman"/>
+          <w:sz w:val="24"/>
+          <w:szCs w:val="24"/>
+        </w:rPr>
+        <w:t>Хай поба</w:t>
+      </w:r>
+      <w:r>
+        <w:rPr>
+          <w:rFonts w:ascii="Times New Roman" w:eastAsia="Gentium Plus" w:hAnsi="Times New Roman" w:cs="Times New Roman"/>
+          <w:color w:val="000000"/>
+          <w:sz w:val="24"/>
+          <w:szCs w:val="24"/>
+        </w:rPr>
+        <w:t>́</w:t>
+      </w:r>
+      <w:r>
+        <w:rPr>
+          <w:rFonts w:ascii="Times New Roman" w:hAnsi="Times New Roman" w:cs="Times New Roman"/>
+          <w:sz w:val="24"/>
+          <w:szCs w:val="24"/>
+        </w:rPr>
+        <w:t>чать це вбо</w:t>
+      </w:r>
+      <w:r>
+        <w:rPr>
+          <w:rFonts w:ascii="Times New Roman" w:eastAsia="Gentium Plus" w:hAnsi="Times New Roman" w:cs="Times New Roman"/>
+          <w:color w:val="000000"/>
+          <w:sz w:val="24"/>
+          <w:szCs w:val="24"/>
+        </w:rPr>
+        <w:t>́</w:t>
+      </w:r>
+      <w:r>
+        <w:rPr>
+          <w:rFonts w:ascii="Times New Roman" w:hAnsi="Times New Roman" w:cs="Times New Roman"/>
+          <w:sz w:val="24"/>
+          <w:szCs w:val="24"/>
+        </w:rPr>
+        <w:t>гі і звеселя</w:t>
+      </w:r>
+      <w:r>
+        <w:rPr>
+          <w:rFonts w:ascii="Times New Roman" w:eastAsia="Gentium Plus" w:hAnsi="Times New Roman" w:cs="Times New Roman"/>
+          <w:color w:val="000000"/>
+          <w:sz w:val="24"/>
+          <w:szCs w:val="24"/>
+        </w:rPr>
+        <w:t>́</w:t>
+      </w:r>
+      <w:r>
+        <w:rPr>
+          <w:rFonts w:ascii="Times New Roman" w:hAnsi="Times New Roman" w:cs="Times New Roman"/>
+          <w:sz w:val="24"/>
+          <w:szCs w:val="24"/>
+        </w:rPr>
+        <w:t>ться.</w:t>
+      </w:r>
+    </w:p>
+    <w:p>
+      <w:pPr>
+        <w:rPr>
+          <w:rFonts w:ascii="Times New Roman" w:hAnsi="Times New Roman" w:cs="Times New Roman"/>
+          <w:sz w:val="24"/>
+          <w:szCs w:val="24"/>
+        </w:rPr>
+      </w:pPr>
+      <w:r>
+        <w:rPr>
+          <w:rFonts w:ascii="Times New Roman" w:hAnsi="Times New Roman" w:cs="Times New Roman"/>
+          <w:i/>
+          <w:color w:val="FF0000"/>
+          <w:sz w:val="24"/>
+          <w:szCs w:val="24"/>
+        </w:rPr>
+        <w:t xml:space="preserve">Стих: </w:t>
+      </w:r>
+      <w:r>
+        <w:rPr>
+          <w:rFonts w:ascii="Times New Roman" w:hAnsi="Times New Roman" w:cs="Times New Roman"/>
+          <w:color w:val="000000"/>
+          <w:sz w:val="24"/>
+          <w:szCs w:val="24"/>
+        </w:rPr>
+        <w:t>Шука</w:t>
+      </w:r>
+      <w:r>
+        <w:rPr>
+          <w:rFonts w:ascii="Times New Roman" w:eastAsia="Gentium Plus" w:hAnsi="Times New Roman" w:cs="Times New Roman"/>
+          <w:color w:val="000000"/>
+          <w:sz w:val="24"/>
+          <w:szCs w:val="24"/>
+        </w:rPr>
+        <w:t>́</w:t>
+      </w:r>
+      <w:r>
+        <w:rPr>
+          <w:rFonts w:ascii="Times New Roman" w:hAnsi="Times New Roman" w:cs="Times New Roman"/>
+          <w:color w:val="000000"/>
+          <w:sz w:val="24"/>
+          <w:szCs w:val="24"/>
+        </w:rPr>
+        <w:t>йте Бо</w:t>
+      </w:r>
+      <w:r>
+        <w:rPr>
+          <w:rFonts w:ascii="Times New Roman" w:eastAsia="Gentium Plus" w:hAnsi="Times New Roman" w:cs="Times New Roman"/>
+          <w:color w:val="000000"/>
+          <w:sz w:val="24"/>
+          <w:szCs w:val="24"/>
+        </w:rPr>
+        <w:t>́</w:t>
+      </w:r>
+      <w:r>
+        <w:rPr>
+          <w:rFonts w:ascii="Times New Roman" w:hAnsi="Times New Roman" w:cs="Times New Roman"/>
+          <w:color w:val="000000"/>
+          <w:sz w:val="24"/>
+          <w:szCs w:val="24"/>
+        </w:rPr>
+        <w:t>га, і жи</w:t>
+      </w:r>
+      <w:r>
+        <w:rPr>
+          <w:rFonts w:ascii="Times New Roman" w:eastAsia="Gentium Plus" w:hAnsi="Times New Roman" w:cs="Times New Roman"/>
+          <w:color w:val="000000"/>
+          <w:sz w:val="24"/>
+          <w:szCs w:val="24"/>
+        </w:rPr>
+        <w:t>́</w:t>
+      </w:r>
+      <w:r>
+        <w:rPr>
+          <w:rFonts w:ascii="Times New Roman" w:hAnsi="Times New Roman" w:cs="Times New Roman"/>
+          <w:color w:val="000000"/>
+          <w:sz w:val="24"/>
+          <w:szCs w:val="24"/>
+        </w:rPr>
+        <w:t>тиме душа</w:t>
+      </w:r>
+      <w:r>
+        <w:rPr>
+          <w:rFonts w:ascii="Times New Roman" w:eastAsia="Gentium Plus" w:hAnsi="Times New Roman" w:cs="Times New Roman"/>
+          <w:color w:val="000000"/>
+          <w:sz w:val="24"/>
+          <w:szCs w:val="24"/>
+        </w:rPr>
+        <w:t>́</w:t>
+      </w:r>
+      <w:r>
+        <w:rPr>
+          <w:rFonts w:ascii="Times New Roman" w:hAnsi="Times New Roman" w:cs="Times New Roman"/>
+          <w:color w:val="000000"/>
+          <w:sz w:val="24"/>
+          <w:szCs w:val="24"/>
+        </w:rPr>
+        <w:t xml:space="preserve"> ва</w:t>
+      </w:r>
+      <w:r>
+        <w:rPr>
+          <w:rFonts w:ascii="Times New Roman" w:eastAsia="Gentium Plus" w:hAnsi="Times New Roman" w:cs="Times New Roman"/>
+          <w:color w:val="000000"/>
+          <w:sz w:val="24"/>
+          <w:szCs w:val="24"/>
+        </w:rPr>
+        <w:t>́</w:t>
+      </w:r>
+      <w:r>
+        <w:rPr>
+          <w:rFonts w:ascii="Times New Roman" w:hAnsi="Times New Roman" w:cs="Times New Roman"/>
+          <w:color w:val="000000"/>
+          <w:sz w:val="24"/>
+          <w:szCs w:val="24"/>
+        </w:rPr>
+        <w:t>ша.</w:t>
+      </w:r>
+    </w:p>
     <w:sectPr>
       <w:pgSz w:w="11906" w:h="16838"/>
       <w:pgMar w:top="850" w:right="850" w:bottom="850" w:left="1417" w:header="708" w:footer="708" w:gutter="0"/>
@@ -4566,15 +8609,15 @@
     <w:lsdException w:name="Unresolved Mention" w:semiHidden="1" w:unhideWhenUsed="1"/>
     <w:lsdException w:name="Smart Link" w:semiHidden="1" w:unhideWhenUsed="1"/>
   </w:latentStyles>
-  <w:style w:type="paragraph" w:default="1" w:styleId="a">
+  <w:style w:type="paragraph" w:default="1" w:styleId="Normal">
     <w:name w:val="Normal"/>
     <w:qFormat/>
   </w:style>
-  <w:style w:type="paragraph" w:styleId="1">
+  <w:style w:type="paragraph" w:styleId="Heading1">
     <w:name w:val="heading 1"/>
-    <w:basedOn w:val="a"/>
-    <w:next w:val="a"/>
-    <w:link w:val="10"/>
+    <w:basedOn w:val="Normal"/>
+    <w:next w:val="Normal"/>
+    <w:link w:val="Heading1Char"/>
     <w:uiPriority w:val="9"/>
     <w:qFormat/>
     <w:rsid w:val="006E0EF1"/>
@@ -4591,11 +8634,11 @@
       <w:szCs w:val="32"/>
     </w:rPr>
   </w:style>
-  <w:style w:type="paragraph" w:styleId="2">
+  <w:style w:type="paragraph" w:styleId="Heading2">
     <w:name w:val="heading 2"/>
-    <w:basedOn w:val="a"/>
-    <w:next w:val="a"/>
-    <w:link w:val="20"/>
+    <w:basedOn w:val="Normal"/>
+    <w:next w:val="Normal"/>
+    <w:link w:val="Heading2Char"/>
     <w:uiPriority w:val="9"/>
     <w:unhideWhenUsed/>
     <w:qFormat/>
@@ -4614,11 +8657,11 @@
       <w:szCs w:val="26"/>
     </w:rPr>
   </w:style>
-  <w:style w:type="paragraph" w:styleId="3">
+  <w:style w:type="paragraph" w:styleId="Heading3">
     <w:name w:val="heading 3"/>
-    <w:basedOn w:val="a"/>
-    <w:next w:val="a"/>
-    <w:link w:val="30"/>
+    <w:basedOn w:val="Normal"/>
+    <w:next w:val="Normal"/>
+    <w:link w:val="Heading3Char"/>
     <w:uiPriority w:val="9"/>
     <w:unhideWhenUsed/>
     <w:qFormat/>
@@ -4636,13 +8679,13 @@
       <w:szCs w:val="24"/>
     </w:rPr>
   </w:style>
-  <w:style w:type="character" w:default="1" w:styleId="a0">
+  <w:style w:type="character" w:default="1" w:styleId="DefaultParagraphFont">
     <w:name w:val="Default Paragraph Font"/>
     <w:uiPriority w:val="1"/>
     <w:semiHidden/>
     <w:unhideWhenUsed/>
   </w:style>
-  <w:style w:type="table" w:default="1" w:styleId="a1">
+  <w:style w:type="table" w:default="1" w:styleId="TableNormal">
     <w:name w:val="Normal Table"/>
     <w:uiPriority w:val="99"/>
     <w:semiHidden/>
@@ -4657,16 +8700,16 @@
       </w:tblCellMar>
     </w:tblPr>
   </w:style>
-  <w:style w:type="numbering" w:default="1" w:styleId="a2">
+  <w:style w:type="numbering" w:default="1" w:styleId="NoList">
     <w:name w:val="No List"/>
     <w:uiPriority w:val="99"/>
     <w:semiHidden/>
     <w:unhideWhenUsed/>
   </w:style>
-  <w:style w:type="character" w:customStyle="1" w:styleId="10">
-    <w:name w:val="Заголовок 1 Знак"/>
-    <w:basedOn w:val="a0"/>
-    <w:link w:val="1"/>
+  <w:style w:type="character" w:customStyle="1" w:styleId="Heading1Char">
+    <w:name w:val="Heading 1 Char"/>
+    <w:basedOn w:val="DefaultParagraphFont"/>
+    <w:link w:val="Heading1"/>
     <w:uiPriority w:val="9"/>
     <w:rsid w:val="006E0EF1"/>
     <w:rPr>
@@ -4676,10 +8719,10 @@
       <w:szCs w:val="32"/>
     </w:rPr>
   </w:style>
-  <w:style w:type="character" w:customStyle="1" w:styleId="30">
-    <w:name w:val="Заголовок 3 Знак"/>
-    <w:basedOn w:val="a0"/>
-    <w:link w:val="3"/>
+  <w:style w:type="character" w:customStyle="1" w:styleId="Heading3Char">
+    <w:name w:val="Heading 3 Char"/>
+    <w:basedOn w:val="DefaultParagraphFont"/>
+    <w:link w:val="Heading3"/>
     <w:uiPriority w:val="9"/>
     <w:rsid w:val="006E0EF1"/>
     <w:rPr>
@@ -4689,9 +8732,9 @@
       <w:szCs w:val="24"/>
     </w:rPr>
   </w:style>
-  <w:style w:type="paragraph" w:styleId="a3">
+  <w:style w:type="paragraph" w:styleId="NormalWeb">
     <w:name w:val="Normal (Web)"/>
-    <w:basedOn w:val="a"/>
+    <w:basedOn w:val="Normal"/>
     <w:uiPriority w:val="99"/>
     <w:unhideWhenUsed/>
     <w:rsid w:val="006E0EF1"/>
@@ -4705,10 +8748,10 @@
       <w:lang w:eastAsia="uk-UA"/>
     </w:rPr>
   </w:style>
-  <w:style w:type="character" w:customStyle="1" w:styleId="20">
-    <w:name w:val="Заголовок 2 Знак"/>
-    <w:basedOn w:val="a0"/>
-    <w:link w:val="2"/>
+  <w:style w:type="character" w:customStyle="1" w:styleId="Heading2Char">
+    <w:name w:val="Heading 2 Char"/>
+    <w:basedOn w:val="DefaultParagraphFont"/>
+    <w:link w:val="Heading2"/>
     <w:uiPriority w:val="9"/>
     <w:rsid w:val="006E0EF1"/>
     <w:rPr>
@@ -4717,6 +8760,24 @@
       <w:color w:val="2F5496" w:themeColor="accent1" w:themeShade="BF"/>
       <w:sz w:val="26"/>
       <w:szCs w:val="26"/>
+    </w:rPr>
+  </w:style>
+  <w:style w:type="paragraph" w:customStyle="1" w:styleId="Standard">
+    <w:name w:val="Standard"/>
+    <w:rsid w:val="00187C98"/>
+    <w:pPr>
+      <w:widowControl w:val="0"/>
+      <w:suppressAutoHyphens/>
+      <w:autoSpaceDN w:val="0"/>
+      <w:spacing w:after="0" w:line="240" w:lineRule="auto"/>
+      <w:textAlignment w:val="baseline"/>
+    </w:pPr>
+    <w:rPr>
+      <w:rFonts w:ascii="Palatino Linotype" w:eastAsia="DejaVu Sans" w:hAnsi="Palatino Linotype" w:cs="Lohit Hindi"/>
+      <w:kern w:val="3"/>
+      <w:sz w:val="24"/>
+      <w:szCs w:val="24"/>
+      <w:lang w:val="en-GB" w:eastAsia="zh-CN" w:bidi="hi-IN"/>
     </w:rPr>
   </w:style>
 </w:styles>

</xml_diff>